<commit_message>
docs: finalize submission report with repository link
Add the GitHub repository URL to the top of the cover, name the submission PDF 2026_ECNU_PJ1_2_王子腾.pdf, add the required six test-category coverage statement, and refresh the Word/PDF renders.
</commit_message>
<xml_diff>
--- a/docs/项目完成报告.docx
+++ b/docs/项目完成报告.docx
@@ -43,7 +43,40 @@
           </w:tcPr>
           <w:p>
             <w:pPr>
-              <w:spacing w:before="360" w:after="0"/>
+              <w:spacing w:after="320"/>
+              <w:ind w:firstLine="0"/>
+              <w:jc w:val="center"/>
+            </w:pPr>
+            <w:r>
+              <w:rPr>
+                <w:rFonts w:cs="Times New Roman"/>
+                <w:color w:val="606060"/>
+                <w:sz w:val="18"/>
+              </w:rPr>
+              <w:t xml:space="preserve">GitHub </w:t>
+            </w:r>
+            <w:r>
+              <w:rPr>
+                <w:rFonts w:cs="Times New Roman"/>
+                <w:color w:val="606060"/>
+                <w:sz w:val="18"/>
+              </w:rPr>
+              <w:t>仓库：</w:t>
+            </w:r>
+            <w:hyperlink r:id="rId8">
+              <w:r>
+                <w:rPr>
+                  <w:color w:val="1F4E79"/>
+                  <w:sz w:val="18"/>
+                  <w:u w:val="single"/>
+                </w:rPr>
+                <w:t>https://github.com/vvangzt/mongo-survey-engine</w:t>
+              </w:r>
+            </w:hyperlink>
+          </w:p>
+          <w:p>
+            <w:pPr>
+              <w:spacing w:before="240" w:after="0"/>
               <w:ind w:firstLine="0"/>
               <w:jc w:val="center"/>
             </w:pPr>
@@ -570,7 +603,7 @@
       <w:r>
         <w:fldChar w:fldCharType="separate"/>
       </w:r>
-      <w:hyperlink w:anchor="_Toc244023897" w:history="1">
+      <w:hyperlink w:anchor="_Toc244025406" w:history="1">
         <w:r>
           <w:rPr>
             <w:rStyle w:val="aff9"/>
@@ -608,7 +641,7 @@
             <w:noProof/>
             <w:webHidden/>
           </w:rPr>
-          <w:instrText>PAGEREF _Toc244023897 \h</w:instrText>
+          <w:instrText>PAGEREF _Toc244025406 \h</w:instrText>
         </w:r>
         <w:r>
           <w:rPr>
@@ -666,7 +699,7 @@
           <w14:ligatures w14:val="standardContextual"/>
         </w:rPr>
       </w:pPr>
-      <w:hyperlink w:anchor="_Toc244023898" w:history="1">
+      <w:hyperlink w:anchor="_Toc244025407" w:history="1">
         <w:r>
           <w:rPr>
             <w:rStyle w:val="aff9"/>
@@ -712,7 +745,7 @@
             <w:noProof/>
             <w:webHidden/>
           </w:rPr>
-          <w:instrText>PAGEREF _Toc244023898 \h</w:instrText>
+          <w:instrText>PAGEREF _Toc244025407 \h</w:instrText>
         </w:r>
         <w:r>
           <w:rPr>
@@ -770,7 +803,7 @@
           <w14:ligatures w14:val="standardContextual"/>
         </w:rPr>
       </w:pPr>
-      <w:hyperlink w:anchor="_Toc244023899" w:history="1">
+      <w:hyperlink w:anchor="_Toc244025408" w:history="1">
         <w:r>
           <w:rPr>
             <w:rStyle w:val="aff9"/>
@@ -816,7 +849,7 @@
             <w:noProof/>
             <w:webHidden/>
           </w:rPr>
-          <w:instrText>PAGEREF _Toc244023899 \h</w:instrText>
+          <w:instrText>PAGEREF _Toc244025408 \h</w:instrText>
         </w:r>
         <w:r>
           <w:rPr>
@@ -875,7 +908,7 @@
           <w14:ligatures w14:val="standardContextual"/>
         </w:rPr>
       </w:pPr>
-      <w:hyperlink w:anchor="_Toc244023900" w:history="1">
+      <w:hyperlink w:anchor="_Toc244025409" w:history="1">
         <w:r>
           <w:rPr>
             <w:rStyle w:val="aff9"/>
@@ -921,7 +954,7 @@
             <w:noProof/>
             <w:webHidden/>
           </w:rPr>
-          <w:instrText>PAGEREF _Toc244023900 \h</w:instrText>
+          <w:instrText>PAGEREF _Toc244025409 \h</w:instrText>
         </w:r>
         <w:r>
           <w:rPr>
@@ -980,7 +1013,7 @@
           <w14:ligatures w14:val="standardContextual"/>
         </w:rPr>
       </w:pPr>
-      <w:hyperlink w:anchor="_Toc244023901" w:history="1">
+      <w:hyperlink w:anchor="_Toc244025410" w:history="1">
         <w:r>
           <w:rPr>
             <w:rStyle w:val="aff9"/>
@@ -1026,7 +1059,7 @@
             <w:noProof/>
             <w:webHidden/>
           </w:rPr>
-          <w:instrText>PAGEREF _Toc244023901 \h</w:instrText>
+          <w:instrText>PAGEREF _Toc244025410 \h</w:instrText>
         </w:r>
         <w:r>
           <w:rPr>
@@ -1085,7 +1118,7 @@
           <w14:ligatures w14:val="standardContextual"/>
         </w:rPr>
       </w:pPr>
-      <w:hyperlink w:anchor="_Toc244023902" w:history="1">
+      <w:hyperlink w:anchor="_Toc244025411" w:history="1">
         <w:r>
           <w:rPr>
             <w:rStyle w:val="aff9"/>
@@ -1131,7 +1164,7 @@
             <w:noProof/>
             <w:webHidden/>
           </w:rPr>
-          <w:instrText>PAGEREF _Toc244023902 \h</w:instrText>
+          <w:instrText>PAGEREF _Toc244025411 \h</w:instrText>
         </w:r>
         <w:r>
           <w:rPr>
@@ -1189,7 +1222,7 @@
           <w14:ligatures w14:val="standardContextual"/>
         </w:rPr>
       </w:pPr>
-      <w:hyperlink w:anchor="_Toc244023903" w:history="1">
+      <w:hyperlink w:anchor="_Toc244025412" w:history="1">
         <w:r>
           <w:rPr>
             <w:rStyle w:val="aff9"/>
@@ -1235,7 +1268,7 @@
             <w:noProof/>
             <w:webHidden/>
           </w:rPr>
-          <w:instrText>PAGEREF _Toc244023903 \h</w:instrText>
+          <w:instrText>PAGEREF _Toc244025412 \h</w:instrText>
         </w:r>
         <w:r>
           <w:rPr>
@@ -1294,7 +1327,7 @@
           <w14:ligatures w14:val="standardContextual"/>
         </w:rPr>
       </w:pPr>
-      <w:hyperlink w:anchor="_Toc244023904" w:history="1">
+      <w:hyperlink w:anchor="_Toc244025413" w:history="1">
         <w:r>
           <w:rPr>
             <w:rStyle w:val="aff9"/>
@@ -1340,7 +1373,7 @@
             <w:noProof/>
             <w:webHidden/>
           </w:rPr>
-          <w:instrText>PAGEREF _Toc244023904 \h</w:instrText>
+          <w:instrText>PAGEREF _Toc244025413 \h</w:instrText>
         </w:r>
         <w:r>
           <w:rPr>
@@ -1399,7 +1432,7 @@
           <w14:ligatures w14:val="standardContextual"/>
         </w:rPr>
       </w:pPr>
-      <w:hyperlink w:anchor="_Toc244023905" w:history="1">
+      <w:hyperlink w:anchor="_Toc244025414" w:history="1">
         <w:r>
           <w:rPr>
             <w:rStyle w:val="aff9"/>
@@ -1445,7 +1478,7 @@
             <w:noProof/>
             <w:webHidden/>
           </w:rPr>
-          <w:instrText>PAGEREF _Toc244023905 \h</w:instrText>
+          <w:instrText>PAGEREF _Toc244025414 \h</w:instrText>
         </w:r>
         <w:r>
           <w:rPr>
@@ -1504,7 +1537,7 @@
           <w14:ligatures w14:val="standardContextual"/>
         </w:rPr>
       </w:pPr>
-      <w:hyperlink w:anchor="_Toc244023906" w:history="1">
+      <w:hyperlink w:anchor="_Toc244025415" w:history="1">
         <w:r>
           <w:rPr>
             <w:rStyle w:val="aff9"/>
@@ -1550,7 +1583,7 @@
             <w:noProof/>
             <w:webHidden/>
           </w:rPr>
-          <w:instrText>PAGEREF _Toc244023906 \h</w:instrText>
+          <w:instrText>PAGEREF _Toc244025415 \h</w:instrText>
         </w:r>
         <w:r>
           <w:rPr>
@@ -1609,7 +1642,7 @@
           <w14:ligatures w14:val="standardContextual"/>
         </w:rPr>
       </w:pPr>
-      <w:hyperlink w:anchor="_Toc244023907" w:history="1">
+      <w:hyperlink w:anchor="_Toc244025416" w:history="1">
         <w:r>
           <w:rPr>
             <w:rStyle w:val="aff9"/>
@@ -1655,7 +1688,7 @@
             <w:noProof/>
             <w:webHidden/>
           </w:rPr>
-          <w:instrText>PAGEREF _Toc244023907 \h</w:instrText>
+          <w:instrText>PAGEREF _Toc244025416 \h</w:instrText>
         </w:r>
         <w:r>
           <w:rPr>
@@ -1714,7 +1747,7 @@
           <w14:ligatures w14:val="standardContextual"/>
         </w:rPr>
       </w:pPr>
-      <w:hyperlink w:anchor="_Toc244023908" w:history="1">
+      <w:hyperlink w:anchor="_Toc244025417" w:history="1">
         <w:r>
           <w:rPr>
             <w:rStyle w:val="aff9"/>
@@ -1760,7 +1793,7 @@
             <w:noProof/>
             <w:webHidden/>
           </w:rPr>
-          <w:instrText>PAGEREF _Toc244023908 \h</w:instrText>
+          <w:instrText>PAGEREF _Toc244025417 \h</w:instrText>
         </w:r>
         <w:r>
           <w:rPr>
@@ -1819,7 +1852,7 @@
           <w14:ligatures w14:val="standardContextual"/>
         </w:rPr>
       </w:pPr>
-      <w:hyperlink w:anchor="_Toc244023909" w:history="1">
+      <w:hyperlink w:anchor="_Toc244025418" w:history="1">
         <w:r>
           <w:rPr>
             <w:rStyle w:val="aff9"/>
@@ -1865,7 +1898,7 @@
             <w:noProof/>
             <w:webHidden/>
           </w:rPr>
-          <w:instrText>PAGEREF _Toc244023909 \h</w:instrText>
+          <w:instrText>PAGEREF _Toc244025418 \h</w:instrText>
         </w:r>
         <w:r>
           <w:rPr>
@@ -1924,7 +1957,7 @@
           <w14:ligatures w14:val="standardContextual"/>
         </w:rPr>
       </w:pPr>
-      <w:hyperlink w:anchor="_Toc244023910" w:history="1">
+      <w:hyperlink w:anchor="_Toc244025419" w:history="1">
         <w:r>
           <w:rPr>
             <w:rStyle w:val="aff9"/>
@@ -1970,7 +2003,7 @@
             <w:noProof/>
             <w:webHidden/>
           </w:rPr>
-          <w:instrText>PAGEREF _Toc244023910 \h</w:instrText>
+          <w:instrText>PAGEREF _Toc244025419 \h</w:instrText>
         </w:r>
         <w:r>
           <w:rPr>
@@ -2029,7 +2062,7 @@
           <w14:ligatures w14:val="standardContextual"/>
         </w:rPr>
       </w:pPr>
-      <w:hyperlink w:anchor="_Toc244023911" w:history="1">
+      <w:hyperlink w:anchor="_Toc244025420" w:history="1">
         <w:r>
           <w:rPr>
             <w:rStyle w:val="aff9"/>
@@ -2075,7 +2108,7 @@
             <w:noProof/>
             <w:webHidden/>
           </w:rPr>
-          <w:instrText>PAGEREF _Toc244023911 \h</w:instrText>
+          <w:instrText>PAGEREF _Toc244025420 \h</w:instrText>
         </w:r>
         <w:r>
           <w:rPr>
@@ -2133,7 +2166,7 @@
           <w14:ligatures w14:val="standardContextual"/>
         </w:rPr>
       </w:pPr>
-      <w:hyperlink w:anchor="_Toc244023912" w:history="1">
+      <w:hyperlink w:anchor="_Toc244025421" w:history="1">
         <w:r>
           <w:rPr>
             <w:rStyle w:val="aff9"/>
@@ -2179,7 +2212,7 @@
             <w:noProof/>
             <w:webHidden/>
           </w:rPr>
-          <w:instrText>PAGEREF _Toc244023912 \h</w:instrText>
+          <w:instrText>PAGEREF _Toc244025421 \h</w:instrText>
         </w:r>
         <w:r>
           <w:rPr>
@@ -2209,7 +2242,7 @@
             <w:noProof/>
             <w:webHidden/>
           </w:rPr>
-          <w:t>8</w:t>
+          <w:t>9</w:t>
         </w:r>
         <w:r>
           <w:rPr>
@@ -2238,7 +2271,7 @@
           <w14:ligatures w14:val="standardContextual"/>
         </w:rPr>
       </w:pPr>
-      <w:hyperlink w:anchor="_Toc244023913" w:history="1">
+      <w:hyperlink w:anchor="_Toc244025422" w:history="1">
         <w:r>
           <w:rPr>
             <w:rStyle w:val="aff9"/>
@@ -2300,7 +2333,7 @@
             <w:noProof/>
             <w:webHidden/>
           </w:rPr>
-          <w:instrText>PAGEREF _Toc244023913 \h</w:instrText>
+          <w:instrText>PAGEREF _Toc244025422 \h</w:instrText>
         </w:r>
         <w:r>
           <w:rPr>
@@ -2330,7 +2363,7 @@
             <w:noProof/>
             <w:webHidden/>
           </w:rPr>
-          <w:t>8</w:t>
+          <w:t>9</w:t>
         </w:r>
         <w:r>
           <w:rPr>
@@ -2359,7 +2392,7 @@
           <w14:ligatures w14:val="standardContextual"/>
         </w:rPr>
       </w:pPr>
-      <w:hyperlink w:anchor="_Toc244023914" w:history="1">
+      <w:hyperlink w:anchor="_Toc244025423" w:history="1">
         <w:r>
           <w:rPr>
             <w:rStyle w:val="aff9"/>
@@ -2405,7 +2438,7 @@
             <w:noProof/>
             <w:webHidden/>
           </w:rPr>
-          <w:instrText>PAGEREF _Toc244023914 \h</w:instrText>
+          <w:instrText>PAGEREF _Toc244025423 \h</w:instrText>
         </w:r>
         <w:r>
           <w:rPr>
@@ -2435,7 +2468,7 @@
             <w:noProof/>
             <w:webHidden/>
           </w:rPr>
-          <w:t>8</w:t>
+          <w:t>9</w:t>
         </w:r>
         <w:r>
           <w:rPr>
@@ -2464,7 +2497,7 @@
           <w14:ligatures w14:val="standardContextual"/>
         </w:rPr>
       </w:pPr>
-      <w:hyperlink w:anchor="_Toc244023915" w:history="1">
+      <w:hyperlink w:anchor="_Toc244025424" w:history="1">
         <w:r>
           <w:rPr>
             <w:rStyle w:val="aff9"/>
@@ -2510,7 +2543,7 @@
             <w:noProof/>
             <w:webHidden/>
           </w:rPr>
-          <w:instrText>PAGEREF _Toc244023915 \h</w:instrText>
+          <w:instrText>PAGEREF _Toc244025424 \h</w:instrText>
         </w:r>
         <w:r>
           <w:rPr>
@@ -2540,7 +2573,7 @@
             <w:noProof/>
             <w:webHidden/>
           </w:rPr>
-          <w:t>9</w:t>
+          <w:t>10</w:t>
         </w:r>
         <w:r>
           <w:rPr>
@@ -2569,7 +2602,7 @@
           <w14:ligatures w14:val="standardContextual"/>
         </w:rPr>
       </w:pPr>
-      <w:hyperlink w:anchor="_Toc244023916" w:history="1">
+      <w:hyperlink w:anchor="_Toc244025425" w:history="1">
         <w:r>
           <w:rPr>
             <w:rStyle w:val="aff9"/>
@@ -2615,7 +2648,7 @@
             <w:noProof/>
             <w:webHidden/>
           </w:rPr>
-          <w:instrText>PAGEREF _Toc244023916 \h</w:instrText>
+          <w:instrText>PAGEREF _Toc244025425 \h</w:instrText>
         </w:r>
         <w:r>
           <w:rPr>
@@ -2645,7 +2678,7 @@
             <w:noProof/>
             <w:webHidden/>
           </w:rPr>
-          <w:t>9</w:t>
+          <w:t>10</w:t>
         </w:r>
         <w:r>
           <w:rPr>
@@ -2674,7 +2707,7 @@
           <w14:ligatures w14:val="standardContextual"/>
         </w:rPr>
       </w:pPr>
-      <w:hyperlink w:anchor="_Toc244023917" w:history="1">
+      <w:hyperlink w:anchor="_Toc244025426" w:history="1">
         <w:r>
           <w:rPr>
             <w:rStyle w:val="aff9"/>
@@ -2720,7 +2753,7 @@
             <w:noProof/>
             <w:webHidden/>
           </w:rPr>
-          <w:instrText>PAGEREF _Toc244023917 \h</w:instrText>
+          <w:instrText>PAGEREF _Toc244025426 \h</w:instrText>
         </w:r>
         <w:r>
           <w:rPr>
@@ -2750,7 +2783,7 @@
             <w:noProof/>
             <w:webHidden/>
           </w:rPr>
-          <w:t>9</w:t>
+          <w:t>10</w:t>
         </w:r>
         <w:r>
           <w:rPr>
@@ -2778,7 +2811,7 @@
           <w14:ligatures w14:val="standardContextual"/>
         </w:rPr>
       </w:pPr>
-      <w:hyperlink w:anchor="_Toc244023918" w:history="1">
+      <w:hyperlink w:anchor="_Toc244025427" w:history="1">
         <w:r>
           <w:rPr>
             <w:rStyle w:val="aff9"/>
@@ -2824,7 +2857,7 @@
             <w:noProof/>
             <w:webHidden/>
           </w:rPr>
-          <w:instrText>PAGEREF _Toc244023918 \h</w:instrText>
+          <w:instrText>PAGEREF _Toc244025427 \h</w:instrText>
         </w:r>
         <w:r>
           <w:rPr>
@@ -2854,7 +2887,7 @@
             <w:noProof/>
             <w:webHidden/>
           </w:rPr>
-          <w:t>10</w:t>
+          <w:t>11</w:t>
         </w:r>
         <w:r>
           <w:rPr>
@@ -2882,7 +2915,7 @@
           <w14:ligatures w14:val="standardContextual"/>
         </w:rPr>
       </w:pPr>
-      <w:hyperlink w:anchor="_Toc244023919" w:history="1">
+      <w:hyperlink w:anchor="_Toc244025428" w:history="1">
         <w:r>
           <w:rPr>
             <w:rStyle w:val="aff9"/>
@@ -2928,7 +2961,7 @@
             <w:noProof/>
             <w:webHidden/>
           </w:rPr>
-          <w:instrText>PAGEREF _Toc244023919 \h</w:instrText>
+          <w:instrText>PAGEREF _Toc244025428 \h</w:instrText>
         </w:r>
         <w:r>
           <w:rPr>
@@ -2958,7 +2991,7 @@
             <w:noProof/>
             <w:webHidden/>
           </w:rPr>
-          <w:t>10</w:t>
+          <w:t>11</w:t>
         </w:r>
         <w:r>
           <w:rPr>
@@ -2986,7 +3019,7 @@
           <w14:ligatures w14:val="standardContextual"/>
         </w:rPr>
       </w:pPr>
-      <w:hyperlink w:anchor="_Toc244023920" w:history="1">
+      <w:hyperlink w:anchor="_Toc244025429" w:history="1">
         <w:r>
           <w:rPr>
             <w:rStyle w:val="aff9"/>
@@ -3032,7 +3065,7 @@
             <w:noProof/>
             <w:webHidden/>
           </w:rPr>
-          <w:instrText>PAGEREF _Toc244023920 \h</w:instrText>
+          <w:instrText>PAGEREF _Toc244025429 \h</w:instrText>
         </w:r>
         <w:r>
           <w:rPr>
@@ -3062,7 +3095,7 @@
             <w:noProof/>
             <w:webHidden/>
           </w:rPr>
-          <w:t>10</w:t>
+          <w:t>11</w:t>
         </w:r>
         <w:r>
           <w:rPr>
@@ -3090,7 +3123,7 @@
           <w14:ligatures w14:val="standardContextual"/>
         </w:rPr>
       </w:pPr>
-      <w:hyperlink w:anchor="_Toc244023921" w:history="1">
+      <w:hyperlink w:anchor="_Toc244025430" w:history="1">
         <w:r>
           <w:rPr>
             <w:rStyle w:val="aff9"/>
@@ -3136,7 +3169,7 @@
             <w:noProof/>
             <w:webHidden/>
           </w:rPr>
-          <w:instrText>PAGEREF _Toc244023921 \h</w:instrText>
+          <w:instrText>PAGEREF _Toc244025430 \h</w:instrText>
         </w:r>
         <w:r>
           <w:rPr>
@@ -3166,7 +3199,7 @@
             <w:noProof/>
             <w:webHidden/>
           </w:rPr>
-          <w:t>11</w:t>
+          <w:t>12</w:t>
         </w:r>
         <w:r>
           <w:rPr>
@@ -3194,7 +3227,7 @@
           <w14:ligatures w14:val="standardContextual"/>
         </w:rPr>
       </w:pPr>
-      <w:hyperlink w:anchor="_Toc244023922" w:history="1">
+      <w:hyperlink w:anchor="_Toc244025431" w:history="1">
         <w:r>
           <w:rPr>
             <w:rStyle w:val="aff9"/>
@@ -3240,7 +3273,7 @@
             <w:noProof/>
             <w:webHidden/>
           </w:rPr>
-          <w:instrText>PAGEREF _Toc244023922 \h</w:instrText>
+          <w:instrText>PAGEREF _Toc244025431 \h</w:instrText>
         </w:r>
         <w:r>
           <w:rPr>
@@ -3270,7 +3303,7 @@
             <w:noProof/>
             <w:webHidden/>
           </w:rPr>
-          <w:t>12</w:t>
+          <w:t>13</w:t>
         </w:r>
         <w:r>
           <w:rPr>
@@ -3299,7 +3332,7 @@
           <w14:ligatures w14:val="standardContextual"/>
         </w:rPr>
       </w:pPr>
-      <w:hyperlink w:anchor="_Toc244023923" w:history="1">
+      <w:hyperlink w:anchor="_Toc244025432" w:history="1">
         <w:r>
           <w:rPr>
             <w:rStyle w:val="aff9"/>
@@ -3345,7 +3378,7 @@
             <w:noProof/>
             <w:webHidden/>
           </w:rPr>
-          <w:instrText>PAGEREF _Toc244023923 \h</w:instrText>
+          <w:instrText>PAGEREF _Toc244025432 \h</w:instrText>
         </w:r>
         <w:r>
           <w:rPr>
@@ -3375,7 +3408,7 @@
             <w:noProof/>
             <w:webHidden/>
           </w:rPr>
-          <w:t>12</w:t>
+          <w:t>13</w:t>
         </w:r>
         <w:r>
           <w:rPr>
@@ -3404,7 +3437,7 @@
           <w14:ligatures w14:val="standardContextual"/>
         </w:rPr>
       </w:pPr>
-      <w:hyperlink w:anchor="_Toc244023924" w:history="1">
+      <w:hyperlink w:anchor="_Toc244025433" w:history="1">
         <w:r>
           <w:rPr>
             <w:rStyle w:val="aff9"/>
@@ -3450,7 +3483,7 @@
             <w:noProof/>
             <w:webHidden/>
           </w:rPr>
-          <w:instrText>PAGEREF _Toc244023924 \h</w:instrText>
+          <w:instrText>PAGEREF _Toc244025433 \h</w:instrText>
         </w:r>
         <w:r>
           <w:rPr>
@@ -3480,7 +3513,7 @@
             <w:noProof/>
             <w:webHidden/>
           </w:rPr>
-          <w:t>12</w:t>
+          <w:t>13</w:t>
         </w:r>
         <w:r>
           <w:rPr>
@@ -3509,7 +3542,7 @@
           <w14:ligatures w14:val="standardContextual"/>
         </w:rPr>
       </w:pPr>
-      <w:hyperlink w:anchor="_Toc244023925" w:history="1">
+      <w:hyperlink w:anchor="_Toc244025434" w:history="1">
         <w:r>
           <w:rPr>
             <w:rStyle w:val="aff9"/>
@@ -3555,7 +3588,7 @@
             <w:noProof/>
             <w:webHidden/>
           </w:rPr>
-          <w:instrText>PAGEREF _Toc244023925 \h</w:instrText>
+          <w:instrText>PAGEREF _Toc244025434 \h</w:instrText>
         </w:r>
         <w:r>
           <w:rPr>
@@ -3585,7 +3618,7 @@
             <w:noProof/>
             <w:webHidden/>
           </w:rPr>
-          <w:t>13</w:t>
+          <w:t>14</w:t>
         </w:r>
         <w:r>
           <w:rPr>
@@ -3614,7 +3647,7 @@
           <w14:ligatures w14:val="standardContextual"/>
         </w:rPr>
       </w:pPr>
-      <w:hyperlink w:anchor="_Toc244023926" w:history="1">
+      <w:hyperlink w:anchor="_Toc244025435" w:history="1">
         <w:r>
           <w:rPr>
             <w:rStyle w:val="aff9"/>
@@ -3660,7 +3693,7 @@
             <w:noProof/>
             <w:webHidden/>
           </w:rPr>
-          <w:instrText>PAGEREF _Toc244023926 \h</w:instrText>
+          <w:instrText>PAGEREF _Toc244025435 \h</w:instrText>
         </w:r>
         <w:r>
           <w:rPr>
@@ -3690,7 +3723,7 @@
             <w:noProof/>
             <w:webHidden/>
           </w:rPr>
-          <w:t>14</w:t>
+          <w:t>15</w:t>
         </w:r>
         <w:r>
           <w:rPr>
@@ -3719,7 +3752,7 @@
           <w14:ligatures w14:val="standardContextual"/>
         </w:rPr>
       </w:pPr>
-      <w:hyperlink w:anchor="_Toc244023927" w:history="1">
+      <w:hyperlink w:anchor="_Toc244025436" w:history="1">
         <w:r>
           <w:rPr>
             <w:rStyle w:val="aff9"/>
@@ -3765,7 +3798,7 @@
             <w:noProof/>
             <w:webHidden/>
           </w:rPr>
-          <w:instrText>PAGEREF _Toc244023927 \h</w:instrText>
+          <w:instrText>PAGEREF _Toc244025436 \h</w:instrText>
         </w:r>
         <w:r>
           <w:rPr>
@@ -3795,7 +3828,7 @@
             <w:noProof/>
             <w:webHidden/>
           </w:rPr>
-          <w:t>14</w:t>
+          <w:t>15</w:t>
         </w:r>
         <w:r>
           <w:rPr>
@@ -3824,7 +3857,7 @@
           <w14:ligatures w14:val="standardContextual"/>
         </w:rPr>
       </w:pPr>
-      <w:hyperlink w:anchor="_Toc244023928" w:history="1">
+      <w:hyperlink w:anchor="_Toc244025437" w:history="1">
         <w:r>
           <w:rPr>
             <w:rStyle w:val="aff9"/>
@@ -3870,7 +3903,7 @@
             <w:noProof/>
             <w:webHidden/>
           </w:rPr>
-          <w:instrText>PAGEREF _Toc244023928 \h</w:instrText>
+          <w:instrText>PAGEREF _Toc244025437 \h</w:instrText>
         </w:r>
         <w:r>
           <w:rPr>
@@ -3900,7 +3933,7 @@
             <w:noProof/>
             <w:webHidden/>
           </w:rPr>
-          <w:t>15</w:t>
+          <w:t>16</w:t>
         </w:r>
         <w:r>
           <w:rPr>
@@ -3928,7 +3961,7 @@
           <w14:ligatures w14:val="standardContextual"/>
         </w:rPr>
       </w:pPr>
-      <w:hyperlink w:anchor="_Toc244023929" w:history="1">
+      <w:hyperlink w:anchor="_Toc244025438" w:history="1">
         <w:r>
           <w:rPr>
             <w:rStyle w:val="aff9"/>
@@ -3974,7 +4007,7 @@
             <w:noProof/>
             <w:webHidden/>
           </w:rPr>
-          <w:instrText>PAGEREF _Toc244023929 \h</w:instrText>
+          <w:instrText>PAGEREF _Toc244025438 \h</w:instrText>
         </w:r>
         <w:r>
           <w:rPr>
@@ -4004,7 +4037,7 @@
             <w:noProof/>
             <w:webHidden/>
           </w:rPr>
-          <w:t>16</w:t>
+          <w:t>17</w:t>
         </w:r>
         <w:r>
           <w:rPr>
@@ -4032,7 +4065,7 @@
           <w14:ligatures w14:val="standardContextual"/>
         </w:rPr>
       </w:pPr>
-      <w:hyperlink w:anchor="_Toc244023930" w:history="1">
+      <w:hyperlink w:anchor="_Toc244025439" w:history="1">
         <w:r>
           <w:rPr>
             <w:rStyle w:val="aff9"/>
@@ -4078,7 +4111,7 @@
             <w:noProof/>
             <w:webHidden/>
           </w:rPr>
-          <w:instrText>PAGEREF _Toc244023930 \h</w:instrText>
+          <w:instrText>PAGEREF _Toc244025439 \h</w:instrText>
         </w:r>
         <w:r>
           <w:rPr>
@@ -4108,7 +4141,7 @@
             <w:noProof/>
             <w:webHidden/>
           </w:rPr>
-          <w:t>16</w:t>
+          <w:t>17</w:t>
         </w:r>
         <w:r>
           <w:rPr>
@@ -4137,7 +4170,7 @@
           <w14:ligatures w14:val="standardContextual"/>
         </w:rPr>
       </w:pPr>
-      <w:hyperlink w:anchor="_Toc244023931" w:history="1">
+      <w:hyperlink w:anchor="_Toc244025440" w:history="1">
         <w:r>
           <w:rPr>
             <w:rStyle w:val="aff9"/>
@@ -4183,7 +4216,7 @@
             <w:noProof/>
             <w:webHidden/>
           </w:rPr>
-          <w:instrText>PAGEREF _Toc244023931 \h</w:instrText>
+          <w:instrText>PAGEREF _Toc244025440 \h</w:instrText>
         </w:r>
         <w:r>
           <w:rPr>
@@ -4213,7 +4246,7 @@
             <w:noProof/>
             <w:webHidden/>
           </w:rPr>
-          <w:t>16</w:t>
+          <w:t>17</w:t>
         </w:r>
         <w:r>
           <w:rPr>
@@ -4242,7 +4275,7 @@
           <w14:ligatures w14:val="standardContextual"/>
         </w:rPr>
       </w:pPr>
-      <w:hyperlink w:anchor="_Toc244023932" w:history="1">
+      <w:hyperlink w:anchor="_Toc244025441" w:history="1">
         <w:r>
           <w:rPr>
             <w:rStyle w:val="aff9"/>
@@ -4288,7 +4321,7 @@
             <w:noProof/>
             <w:webHidden/>
           </w:rPr>
-          <w:instrText>PAGEREF _Toc244023932 \h</w:instrText>
+          <w:instrText>PAGEREF _Toc244025441 \h</w:instrText>
         </w:r>
         <w:r>
           <w:rPr>
@@ -4318,7 +4351,7 @@
             <w:noProof/>
             <w:webHidden/>
           </w:rPr>
-          <w:t>17</w:t>
+          <w:t>18</w:t>
         </w:r>
         <w:r>
           <w:rPr>
@@ -4347,7 +4380,7 @@
           <w14:ligatures w14:val="standardContextual"/>
         </w:rPr>
       </w:pPr>
-      <w:hyperlink w:anchor="_Toc244023933" w:history="1">
+      <w:hyperlink w:anchor="_Toc244025442" w:history="1">
         <w:r>
           <w:rPr>
             <w:rStyle w:val="aff9"/>
@@ -4393,7 +4426,7 @@
             <w:noProof/>
             <w:webHidden/>
           </w:rPr>
-          <w:instrText>PAGEREF _Toc244023933 \h</w:instrText>
+          <w:instrText>PAGEREF _Toc244025442 \h</w:instrText>
         </w:r>
         <w:r>
           <w:rPr>
@@ -4423,7 +4456,7 @@
             <w:noProof/>
             <w:webHidden/>
           </w:rPr>
-          <w:t>17</w:t>
+          <w:t>18</w:t>
         </w:r>
         <w:r>
           <w:rPr>
@@ -4452,7 +4485,7 @@
           <w14:ligatures w14:val="standardContextual"/>
         </w:rPr>
       </w:pPr>
-      <w:hyperlink w:anchor="_Toc244023934" w:history="1">
+      <w:hyperlink w:anchor="_Toc244025443" w:history="1">
         <w:r>
           <w:rPr>
             <w:rStyle w:val="aff9"/>
@@ -4498,7 +4531,7 @@
             <w:noProof/>
             <w:webHidden/>
           </w:rPr>
-          <w:instrText>PAGEREF _Toc244023934 \h</w:instrText>
+          <w:instrText>PAGEREF _Toc244025443 \h</w:instrText>
         </w:r>
         <w:r>
           <w:rPr>
@@ -4528,7 +4561,7 @@
             <w:noProof/>
             <w:webHidden/>
           </w:rPr>
-          <w:t>18</w:t>
+          <w:t>19</w:t>
         </w:r>
         <w:r>
           <w:rPr>
@@ -4556,7 +4589,7 @@
           <w14:ligatures w14:val="standardContextual"/>
         </w:rPr>
       </w:pPr>
-      <w:hyperlink w:anchor="_Toc244023935" w:history="1">
+      <w:hyperlink w:anchor="_Toc244025444" w:history="1">
         <w:r>
           <w:rPr>
             <w:rStyle w:val="aff9"/>
@@ -4602,7 +4635,7 @@
             <w:noProof/>
             <w:webHidden/>
           </w:rPr>
-          <w:instrText>PAGEREF _Toc244023935 \h</w:instrText>
+          <w:instrText>PAGEREF _Toc244025444 \h</w:instrText>
         </w:r>
         <w:r>
           <w:rPr>
@@ -4632,7 +4665,7 @@
             <w:noProof/>
             <w:webHidden/>
           </w:rPr>
-          <w:t>18</w:t>
+          <w:t>19</w:t>
         </w:r>
         <w:r>
           <w:rPr>
@@ -4660,7 +4693,7 @@
           <w14:ligatures w14:val="standardContextual"/>
         </w:rPr>
       </w:pPr>
-      <w:hyperlink w:anchor="_Toc244023936" w:history="1">
+      <w:hyperlink w:anchor="_Toc244025445" w:history="1">
         <w:r>
           <w:rPr>
             <w:rStyle w:val="aff9"/>
@@ -4706,7 +4739,7 @@
             <w:noProof/>
             <w:webHidden/>
           </w:rPr>
-          <w:instrText>PAGEREF _Toc244023936 \h</w:instrText>
+          <w:instrText>PAGEREF _Toc244025445 \h</w:instrText>
         </w:r>
         <w:r>
           <w:rPr>
@@ -4736,7 +4769,7 @@
             <w:noProof/>
             <w:webHidden/>
           </w:rPr>
-          <w:t>18</w:t>
+          <w:t>19</w:t>
         </w:r>
         <w:r>
           <w:rPr>
@@ -4764,7 +4797,7 @@
           <w14:ligatures w14:val="standardContextual"/>
         </w:rPr>
       </w:pPr>
-      <w:hyperlink w:anchor="_Toc244023937" w:history="1">
+      <w:hyperlink w:anchor="_Toc244025446" w:history="1">
         <w:r>
           <w:rPr>
             <w:rStyle w:val="aff9"/>
@@ -4810,7 +4843,7 @@
             <w:noProof/>
             <w:webHidden/>
           </w:rPr>
-          <w:instrText>PAGEREF _Toc244023937 \h</w:instrText>
+          <w:instrText>PAGEREF _Toc244025446 \h</w:instrText>
         </w:r>
         <w:r>
           <w:rPr>
@@ -4840,7 +4873,7 @@
             <w:noProof/>
             <w:webHidden/>
           </w:rPr>
-          <w:t>19</w:t>
+          <w:t>20</w:t>
         </w:r>
         <w:r>
           <w:rPr>
@@ -4869,7 +4902,7 @@
           <w14:ligatures w14:val="standardContextual"/>
         </w:rPr>
       </w:pPr>
-      <w:hyperlink w:anchor="_Toc244023938" w:history="1">
+      <w:hyperlink w:anchor="_Toc244025447" w:history="1">
         <w:r>
           <w:rPr>
             <w:rStyle w:val="aff9"/>
@@ -4915,7 +4948,7 @@
             <w:noProof/>
             <w:webHidden/>
           </w:rPr>
-          <w:instrText>PAGEREF _Toc244023938 \h</w:instrText>
+          <w:instrText>PAGEREF _Toc244025447 \h</w:instrText>
         </w:r>
         <w:r>
           <w:rPr>
@@ -4945,7 +4978,7 @@
             <w:noProof/>
             <w:webHidden/>
           </w:rPr>
-          <w:t>19</w:t>
+          <w:t>20</w:t>
         </w:r>
         <w:r>
           <w:rPr>
@@ -4974,7 +5007,7 @@
           <w14:ligatures w14:val="standardContextual"/>
         </w:rPr>
       </w:pPr>
-      <w:hyperlink w:anchor="_Toc244023939" w:history="1">
+      <w:hyperlink w:anchor="_Toc244025448" w:history="1">
         <w:r>
           <w:rPr>
             <w:rStyle w:val="aff9"/>
@@ -5020,7 +5053,7 @@
             <w:noProof/>
             <w:webHidden/>
           </w:rPr>
-          <w:instrText>PAGEREF _Toc244023939 \h</w:instrText>
+          <w:instrText>PAGEREF _Toc244025448 \h</w:instrText>
         </w:r>
         <w:r>
           <w:rPr>
@@ -5050,7 +5083,7 @@
             <w:noProof/>
             <w:webHidden/>
           </w:rPr>
-          <w:t>19</w:t>
+          <w:t>20</w:t>
         </w:r>
         <w:r>
           <w:rPr>
@@ -5079,7 +5112,7 @@
           <w14:ligatures w14:val="standardContextual"/>
         </w:rPr>
       </w:pPr>
-      <w:hyperlink w:anchor="_Toc244023940" w:history="1">
+      <w:hyperlink w:anchor="_Toc244025449" w:history="1">
         <w:r>
           <w:rPr>
             <w:rStyle w:val="aff9"/>
@@ -5125,7 +5158,7 @@
             <w:noProof/>
             <w:webHidden/>
           </w:rPr>
-          <w:instrText>PAGEREF _Toc244023940 \h</w:instrText>
+          <w:instrText>PAGEREF _Toc244025449 \h</w:instrText>
         </w:r>
         <w:r>
           <w:rPr>
@@ -5155,7 +5188,7 @@
             <w:noProof/>
             <w:webHidden/>
           </w:rPr>
-          <w:t>20</w:t>
+          <w:t>21</w:t>
         </w:r>
         <w:r>
           <w:rPr>
@@ -5183,7 +5216,7 @@
           <w14:ligatures w14:val="standardContextual"/>
         </w:rPr>
       </w:pPr>
-      <w:hyperlink w:anchor="_Toc244023941" w:history="1">
+      <w:hyperlink w:anchor="_Toc244025450" w:history="1">
         <w:r>
           <w:rPr>
             <w:rStyle w:val="aff9"/>
@@ -5237,7 +5270,7 @@
             <w:noProof/>
             <w:webHidden/>
           </w:rPr>
-          <w:instrText>PAGEREF _Toc244023941 \h</w:instrText>
+          <w:instrText>PAGEREF _Toc244025450 \h</w:instrText>
         </w:r>
         <w:r>
           <w:rPr>
@@ -5267,7 +5300,7 @@
             <w:noProof/>
             <w:webHidden/>
           </w:rPr>
-          <w:t>21</w:t>
+          <w:t>22</w:t>
         </w:r>
         <w:r>
           <w:rPr>
@@ -5343,8 +5376,8 @@
     <w:p>
       <w:pPr>
         <w:sectPr>
-          <w:headerReference w:type="default" r:id="rId8"/>
-          <w:footerReference w:type="default" r:id="rId9"/>
+          <w:headerReference w:type="default" r:id="rId9"/>
+          <w:footerReference w:type="default" r:id="rId10"/>
           <w:pgSz w:w="11906" w:h="16838"/>
           <w:pgMar w:top="1440" w:right="1417" w:bottom="1440" w:left="1701" w:header="737" w:footer="794" w:gutter="0"/>
           <w:pgNumType w:fmt="upperRoman" w:start="1"/>
@@ -5357,7 +5390,7 @@
       <w:pPr>
         <w:pStyle w:val="Heading1"/>
       </w:pPr>
-      <w:bookmarkStart w:id="0" w:name="_Toc244023897"/>
+      <w:bookmarkStart w:id="0" w:name="_Toc244025406"/>
       <w:r>
         <w:rPr>
           <w:rFonts w:ascii="Times New Roman" w:eastAsia="黑体" w:hAnsi="Times New Roman" w:cs="Times New Roman"/>
@@ -5559,7 +5592,7 @@
         <w:pStyle w:val="Heading1"/>
         <w:pageBreakBefore/>
       </w:pPr>
-      <w:bookmarkStart w:id="1" w:name="_Toc244023898"/>
+      <w:bookmarkStart w:id="1" w:name="_Toc244025407"/>
       <w:r>
         <w:rPr>
           <w:rFonts w:ascii="Times New Roman" w:eastAsia="黑体" w:hAnsi="Times New Roman" w:cs="Times New Roman"/>
@@ -5608,7 +5641,7 @@
         <w:rPr>
           <w:rFonts w:cs="Times New Roman"/>
         </w:rPr>
-        <w:t>；前端使用</w:t>
+        <w:t>；不使用关系数据库，也未使用现成问卷系统框架。前端使用</w:t>
       </w:r>
       <w:r>
         <w:rPr>
@@ -6475,7 +6508,7 @@
       <w:pPr>
         <w:pStyle w:val="Heading1"/>
       </w:pPr>
-      <w:bookmarkStart w:id="2" w:name="_Toc244023899"/>
+      <w:bookmarkStart w:id="2" w:name="_Toc244025408"/>
       <w:r>
         <w:rPr>
           <w:rFonts w:ascii="Times New Roman" w:eastAsia="黑体" w:hAnsi="Times New Roman" w:cs="Times New Roman"/>
@@ -6590,7 +6623,7 @@
       <w:pPr>
         <w:pStyle w:val="Heading2"/>
       </w:pPr>
-      <w:bookmarkStart w:id="3" w:name="_Toc244023900"/>
+      <w:bookmarkStart w:id="3" w:name="_Toc244025409"/>
       <w:r>
         <w:rPr>
           <w:rFonts w:ascii="Times New Roman" w:eastAsia="黑体" w:hAnsi="Times New Roman" w:cs="Times New Roman"/>
@@ -7843,7 +7876,7 @@
       <w:pPr>
         <w:pStyle w:val="Heading2"/>
       </w:pPr>
-      <w:bookmarkStart w:id="4" w:name="_Toc244023901"/>
+      <w:bookmarkStart w:id="4" w:name="_Toc244025410"/>
       <w:r>
         <w:rPr>
           <w:rFonts w:ascii="Times New Roman" w:eastAsia="黑体" w:hAnsi="Times New Roman" w:cs="Times New Roman"/>
@@ -9538,7 +9571,7 @@
       <w:pPr>
         <w:pStyle w:val="Heading2"/>
       </w:pPr>
-      <w:bookmarkStart w:id="5" w:name="_Toc244023902"/>
+      <w:bookmarkStart w:id="5" w:name="_Toc244025411"/>
       <w:r>
         <w:rPr>
           <w:rFonts w:ascii="Times New Roman" w:eastAsia="黑体" w:hAnsi="Times New Roman" w:cs="Times New Roman"/>
@@ -10222,7 +10255,7 @@
       <w:pPr>
         <w:pStyle w:val="Heading1"/>
       </w:pPr>
-      <w:bookmarkStart w:id="6" w:name="_Toc244023903"/>
+      <w:bookmarkStart w:id="6" w:name="_Toc244025412"/>
       <w:r>
         <w:rPr>
           <w:rFonts w:ascii="Times New Roman" w:eastAsia="黑体" w:hAnsi="Times New Roman" w:cs="Times New Roman"/>
@@ -10241,7 +10274,7 @@
       <w:pPr>
         <w:pStyle w:val="Heading2"/>
       </w:pPr>
-      <w:bookmarkStart w:id="7" w:name="_Toc244023904"/>
+      <w:bookmarkStart w:id="7" w:name="_Toc244025413"/>
       <w:r>
         <w:rPr>
           <w:rFonts w:ascii="Times New Roman" w:eastAsia="黑体" w:hAnsi="Times New Roman" w:cs="Times New Roman"/>
@@ -10461,7 +10494,7 @@
       <w:pPr>
         <w:pStyle w:val="Heading2"/>
       </w:pPr>
-      <w:bookmarkStart w:id="8" w:name="_Toc244023905"/>
+      <w:bookmarkStart w:id="8" w:name="_Toc244025414"/>
       <w:r>
         <w:rPr>
           <w:rFonts w:ascii="Times New Roman" w:eastAsia="黑体" w:hAnsi="Times New Roman" w:cs="Times New Roman"/>
@@ -10825,7 +10858,7 @@
       <w:pPr>
         <w:pStyle w:val="Heading2"/>
       </w:pPr>
-      <w:bookmarkStart w:id="9" w:name="_Toc244023906"/>
+      <w:bookmarkStart w:id="9" w:name="_Toc244025415"/>
       <w:r>
         <w:rPr>
           <w:rFonts w:ascii="Times New Roman" w:eastAsia="黑体" w:hAnsi="Times New Roman" w:cs="Times New Roman"/>
@@ -10916,7 +10949,7 @@
       <w:pPr>
         <w:pStyle w:val="Heading2"/>
       </w:pPr>
-      <w:bookmarkStart w:id="10" w:name="_Toc244023907"/>
+      <w:bookmarkStart w:id="10" w:name="_Toc244025416"/>
       <w:r>
         <w:rPr>
           <w:rFonts w:ascii="Times New Roman" w:eastAsia="黑体" w:hAnsi="Times New Roman" w:cs="Times New Roman"/>
@@ -12361,7 +12394,7 @@
       <w:pPr>
         <w:pStyle w:val="Heading2"/>
       </w:pPr>
-      <w:bookmarkStart w:id="11" w:name="_Toc244023908"/>
+      <w:bookmarkStart w:id="11" w:name="_Toc244025417"/>
       <w:r>
         <w:rPr>
           <w:rFonts w:ascii="Times New Roman" w:eastAsia="黑体" w:hAnsi="Times New Roman" w:cs="Times New Roman"/>
@@ -12467,6 +12500,7 @@
           <w:sz w:val="17"/>
         </w:rPr>
         <w:br/>
+        <w:t>question_versions</w:t>
       </w:r>
       <w:r>
         <w:rPr>
@@ -12474,7 +12508,7 @@
           <w:color w:val="1F1F1F"/>
           <w:sz w:val="17"/>
         </w:rPr>
-        <w:t>question_versions</w:t>
+        <w:t>（内容，不可变）</w:t>
       </w:r>
       <w:r>
         <w:rPr>
@@ -12482,7 +12516,8 @@
           <w:color w:val="1F1F1F"/>
           <w:sz w:val="17"/>
         </w:rPr>
-        <w:t>（内容，不可变）</w:t>
+        <w:br/>
+        <w:t xml:space="preserve">  _id, entity_id, version_no, parent_version_id, restored_from_version_id,</w:t>
       </w:r>
       <w:r>
         <w:rPr>
@@ -12491,7 +12526,7 @@
           <w:sz w:val="17"/>
         </w:rPr>
         <w:br/>
-        <w:t xml:space="preserve">  _id, entity_id, version_no, parent_version_id, restored_from_version_id,</w:t>
+        <w:t xml:space="preserve">  content { type, title, description, required, options, validation },</w:t>
       </w:r>
       <w:r>
         <w:rPr>
@@ -12500,7 +12535,7 @@
           <w:sz w:val="17"/>
         </w:rPr>
         <w:br/>
-        <w:t xml:space="preserve">  content { type, title, description, required, options, validation },</w:t>
+        <w:t xml:space="preserve">  content_hash, created_by, created_at, legacy_key</w:t>
       </w:r>
       <w:r>
         <w:rPr>
@@ -12509,7 +12544,6 @@
           <w:sz w:val="17"/>
         </w:rPr>
         <w:br/>
-        <w:t xml:space="preserve">  content_hash, created_by, created_at, legacy_key</w:t>
       </w:r>
       <w:r>
         <w:rPr>
@@ -12518,6 +12552,7 @@
           <w:sz w:val="17"/>
         </w:rPr>
         <w:br/>
+        <w:t>question_shares</w:t>
       </w:r>
       <w:r>
         <w:rPr>
@@ -12526,7 +12561,7 @@
           <w:sz w:val="17"/>
         </w:rPr>
         <w:br/>
-        <w:t>question_shares</w:t>
+        <w:t xml:space="preserve">  entity_id, grantee_id, permission(view|use), granted_by, created_at</w:t>
       </w:r>
       <w:r>
         <w:rPr>
@@ -12535,7 +12570,6 @@
           <w:sz w:val="17"/>
         </w:rPr>
         <w:br/>
-        <w:t xml:space="preserve">  entity_id, grantee_id, permission(view|use), granted_by, created_at</w:t>
       </w:r>
       <w:r>
         <w:rPr>
@@ -12551,7 +12585,6 @@
           <w:color w:val="1F1F1F"/>
           <w:sz w:val="17"/>
         </w:rPr>
-        <w:br/>
         <w:t>question_libraries / question_library_items</w:t>
       </w:r>
       <w:r>
@@ -12681,13 +12714,6 @@
           <w:sz w:val="17"/>
         </w:rPr>
         <w:br/>
-      </w:r>
-      <w:r>
-        <w:rPr>
-          <w:rFonts w:ascii="Courier New" w:hAnsi="Courier New" w:cs="Courier New"/>
-          <w:color w:val="1F1F1F"/>
-          <w:sz w:val="17"/>
-        </w:rPr>
         <w:t xml:space="preserve">  "options": [{ "option_id": "o_opt_00000000", "label": "</w:t>
       </w:r>
       <w:r>
@@ -12764,7 +12790,7 @@
       <w:pPr>
         <w:pStyle w:val="Heading2"/>
       </w:pPr>
-      <w:bookmarkStart w:id="12" w:name="_Toc244023909"/>
+      <w:bookmarkStart w:id="12" w:name="_Toc244025418"/>
       <w:r>
         <w:rPr>
           <w:rFonts w:ascii="Times New Roman" w:eastAsia="黑体" w:hAnsi="Times New Roman" w:cs="Times New Roman"/>
@@ -13120,7 +13146,55 @@
         <w:rPr>
           <w:rFonts w:cs="Times New Roman"/>
         </w:rPr>
-        <w:t>编辑器两个入口，全部调用同一套</w:t>
+        <w:t>编辑器两个入口；题目详情页提供</w:t>
+      </w:r>
+      <w:r>
+        <w:rPr>
+          <w:rFonts w:cs="Times New Roman"/>
+        </w:rPr>
+        <w:t>“</w:t>
+      </w:r>
+      <w:r>
+        <w:rPr>
+          <w:rFonts w:cs="Times New Roman"/>
+        </w:rPr>
+        <w:t>改题（生成新版本）</w:t>
+      </w:r>
+      <w:r>
+        <w:rPr>
+          <w:rFonts w:cs="Times New Roman"/>
+        </w:rPr>
+        <w:t>”</w:t>
+      </w:r>
+      <w:r>
+        <w:rPr>
+          <w:rFonts w:cs="Times New Roman"/>
+        </w:rPr>
+        <w:t>和</w:t>
+      </w:r>
+      <w:r>
+        <w:rPr>
+          <w:rFonts w:cs="Times New Roman"/>
+        </w:rPr>
+        <w:t>“</w:t>
+      </w:r>
+      <w:r>
+        <w:rPr>
+          <w:rFonts w:cs="Times New Roman"/>
+        </w:rPr>
+        <w:t>派生为新题目</w:t>
+      </w:r>
+      <w:r>
+        <w:rPr>
+          <w:rFonts w:cs="Times New Roman"/>
+        </w:rPr>
+        <w:t>”</w:t>
+      </w:r>
+      <w:r>
+        <w:rPr>
+          <w:rFonts w:cs="Times New Roman"/>
+        </w:rPr>
+        <w:t>两个动作，分别对应保留题目实体与创建新实体，全部调用同一套</w:t>
       </w:r>
       <w:r>
         <w:rPr>
@@ -13139,7 +13213,7 @@
       <w:pPr>
         <w:pStyle w:val="Heading2"/>
       </w:pPr>
-      <w:bookmarkStart w:id="13" w:name="_Toc244023910"/>
+      <w:bookmarkStart w:id="13" w:name="_Toc244025419"/>
       <w:r>
         <w:rPr>
           <w:rFonts w:ascii="Times New Roman" w:eastAsia="黑体" w:hAnsi="Times New Roman" w:cs="Times New Roman"/>
@@ -13719,6 +13793,7 @@
         <w:rPr>
           <w:rFonts w:cs="Times New Roman"/>
         </w:rPr>
+        <w:lastRenderedPageBreak/>
         <w:t>兼容性不是靠声明，而是有可执行测试。新增的</w:t>
       </w:r>
       <w:r>
@@ -14480,12 +14555,11 @@
       <w:pPr>
         <w:pStyle w:val="Heading2"/>
       </w:pPr>
-      <w:bookmarkStart w:id="14" w:name="_Toc244023911"/>
+      <w:bookmarkStart w:id="14" w:name="_Toc244025420"/>
       <w:r>
         <w:rPr>
           <w:rFonts w:ascii="Times New Roman" w:eastAsia="黑体" w:hAnsi="Times New Roman" w:cs="Times New Roman"/>
         </w:rPr>
-        <w:lastRenderedPageBreak/>
         <w:t xml:space="preserve">3.8 </w:t>
       </w:r>
       <w:r>
@@ -14696,11 +14770,12 @@
       <w:pPr>
         <w:pStyle w:val="Heading1"/>
       </w:pPr>
-      <w:bookmarkStart w:id="15" w:name="_Toc244023912"/>
+      <w:bookmarkStart w:id="15" w:name="_Toc244025421"/>
       <w:r>
         <w:rPr>
           <w:rFonts w:ascii="Times New Roman" w:eastAsia="黑体" w:hAnsi="Times New Roman" w:cs="Times New Roman"/>
         </w:rPr>
+        <w:lastRenderedPageBreak/>
         <w:t xml:space="preserve">4. MongoDB </w:t>
       </w:r>
       <w:r>
@@ -14715,7 +14790,7 @@
       <w:pPr>
         <w:pStyle w:val="Heading2"/>
       </w:pPr>
-      <w:bookmarkStart w:id="16" w:name="_Toc244023913"/>
+      <w:bookmarkStart w:id="16" w:name="_Toc244025422"/>
       <w:r>
         <w:rPr>
           <w:rFonts w:ascii="Times New Roman" w:eastAsia="黑体" w:hAnsi="Times New Roman" w:cs="Times New Roman"/>
@@ -15685,7 +15760,7 @@
       <w:pPr>
         <w:pStyle w:val="Heading2"/>
       </w:pPr>
-      <w:bookmarkStart w:id="17" w:name="_Toc244023914"/>
+      <w:bookmarkStart w:id="17" w:name="_Toc244025423"/>
       <w:r>
         <w:rPr>
           <w:rFonts w:ascii="Times New Roman" w:eastAsia="黑体" w:hAnsi="Times New Roman" w:cs="Times New Roman"/>
@@ -15811,7 +15886,6 @@
         <w:rPr>
           <w:rFonts w:cs="Times New Roman"/>
         </w:rPr>
-        <w:lastRenderedPageBreak/>
         <w:t xml:space="preserve">3. </w:t>
       </w:r>
       <w:r>
@@ -15873,11 +15947,12 @@
       <w:pPr>
         <w:pStyle w:val="Heading2"/>
       </w:pPr>
-      <w:bookmarkStart w:id="18" w:name="_Toc244023915"/>
+      <w:bookmarkStart w:id="18" w:name="_Toc244025424"/>
       <w:r>
         <w:rPr>
           <w:rFonts w:ascii="Times New Roman" w:eastAsia="黑体" w:hAnsi="Times New Roman" w:cs="Times New Roman"/>
         </w:rPr>
+        <w:lastRenderedPageBreak/>
         <w:t xml:space="preserve">4.3 </w:t>
       </w:r>
       <w:r>
@@ -15958,7 +16033,6 @@
           <w:sz w:val="17"/>
         </w:rPr>
         <w:br/>
-        <w:t>survey_versions: { questions.question_ref.version_id: 1 }</w:t>
       </w:r>
       <w:r>
         <w:rPr>
@@ -15966,8 +16040,7 @@
           <w:color w:val="1F1F1F"/>
           <w:sz w:val="17"/>
         </w:rPr>
-        <w:br/>
-        <w:t xml:space="preserve">  # </w:t>
+        <w:t>survey_versions: { questions.question_ref.version_id: 1 }</w:t>
       </w:r>
       <w:r>
         <w:rPr>
@@ -15975,7 +16048,8 @@
           <w:color w:val="1F1F1F"/>
           <w:sz w:val="17"/>
         </w:rPr>
-        <w:t>版本级使用</w:t>
+        <w:br/>
+        <w:t xml:space="preserve">  # </w:t>
       </w:r>
       <w:r>
         <w:rPr>
@@ -15983,8 +16057,7 @@
           <w:color w:val="1F1F1F"/>
           <w:sz w:val="17"/>
         </w:rPr>
-        <w:br/>
-        <w:t>responses:       { answers.question_ref.entity_id: 1, submitted_at: -1 }</w:t>
+        <w:t>版本级使用</w:t>
       </w:r>
       <w:r>
         <w:rPr>
@@ -15993,7 +16066,7 @@
           <w:sz w:val="17"/>
         </w:rPr>
         <w:br/>
-        <w:t xml:space="preserve">  # </w:t>
+        <w:t>responses:       { answers.question_ref.entity_id: 1, submitted_at: -1 }</w:t>
       </w:r>
       <w:r>
         <w:rPr>
@@ -16001,7 +16074,8 @@
           <w:color w:val="1F1F1F"/>
           <w:sz w:val="17"/>
         </w:rPr>
-        <w:t>跨问卷统计</w:t>
+        <w:br/>
+        <w:t xml:space="preserve">  # </w:t>
       </w:r>
       <w:r>
         <w:rPr>
@@ -16009,7 +16083,7 @@
           <w:color w:val="1F1F1F"/>
           <w:sz w:val="17"/>
         </w:rPr>
-        <w:br/>
+        <w:t>跨问卷统计</w:t>
       </w:r>
       <w:r>
         <w:rPr>
@@ -16017,6 +16091,7 @@
           <w:color w:val="1F1F1F"/>
           <w:sz w:val="17"/>
         </w:rPr>
+        <w:br/>
         <w:t>responses:       { answers.question_ref.version_id: 1 }</w:t>
       </w:r>
     </w:p>
@@ -16114,7 +16189,7 @@
       <w:pPr>
         <w:pStyle w:val="Heading2"/>
       </w:pPr>
-      <w:bookmarkStart w:id="19" w:name="_Toc244023916"/>
+      <w:bookmarkStart w:id="19" w:name="_Toc244025425"/>
       <w:r>
         <w:rPr>
           <w:rFonts w:ascii="Times New Roman" w:eastAsia="黑体" w:hAnsi="Times New Roman" w:cs="Times New Roman"/>
@@ -17113,7 +17188,7 @@
       <w:pPr>
         <w:pStyle w:val="Heading2"/>
       </w:pPr>
-      <w:bookmarkStart w:id="20" w:name="_Toc244023917"/>
+      <w:bookmarkStart w:id="20" w:name="_Toc244025426"/>
       <w:r>
         <w:rPr>
           <w:rFonts w:ascii="Times New Roman" w:eastAsia="黑体" w:hAnsi="Times New Roman" w:cs="Times New Roman"/>
@@ -17197,7 +17272,6 @@
         <w:rPr>
           <w:rFonts w:cs="Times New Roman"/>
         </w:rPr>
-        <w:lastRenderedPageBreak/>
         <w:t xml:space="preserve">• </w:t>
       </w:r>
       <w:r>
@@ -17260,6 +17334,7 @@
         <w:rPr>
           <w:rFonts w:cs="Times New Roman"/>
         </w:rPr>
+        <w:lastRenderedPageBreak/>
         <w:t xml:space="preserve">• </w:t>
       </w:r>
       <w:r>
@@ -17311,7 +17386,7 @@
       <w:pPr>
         <w:pStyle w:val="Heading1"/>
       </w:pPr>
-      <w:bookmarkStart w:id="21" w:name="_Toc244023918"/>
+      <w:bookmarkStart w:id="21" w:name="_Toc244025427"/>
       <w:r>
         <w:rPr>
           <w:rFonts w:ascii="Times New Roman" w:eastAsia="黑体" w:hAnsi="Times New Roman" w:cs="Times New Roman"/>
@@ -17496,7 +17571,7 @@
       <w:pPr>
         <w:pStyle w:val="Heading1"/>
       </w:pPr>
-      <w:bookmarkStart w:id="22" w:name="_Toc244023919"/>
+      <w:bookmarkStart w:id="22" w:name="_Toc244025428"/>
       <w:r>
         <w:rPr>
           <w:rFonts w:ascii="Times New Roman" w:eastAsia="黑体" w:hAnsi="Times New Roman" w:cs="Times New Roman"/>
@@ -18082,7 +18157,7 @@
       <w:pPr>
         <w:pStyle w:val="Heading1"/>
       </w:pPr>
-      <w:bookmarkStart w:id="23" w:name="_Toc244023920"/>
+      <w:bookmarkStart w:id="23" w:name="_Toc244025429"/>
       <w:r>
         <w:rPr>
           <w:rFonts w:ascii="Times New Roman" w:eastAsia="黑体" w:hAnsi="Times New Roman" w:cs="Times New Roman"/>
@@ -18148,7 +18223,6 @@
           <w:b/>
           <w:sz w:val="21"/>
         </w:rPr>
-        <w:lastRenderedPageBreak/>
         <w:t>表</w:t>
       </w:r>
       <w:r>
@@ -18430,6 +18504,7 @@
                 <w:color w:val="1F1F1F"/>
                 <w:sz w:val="16"/>
               </w:rPr>
+              <w:lastRenderedPageBreak/>
               <w:t>survey_count</w:t>
             </w:r>
           </w:p>
@@ -19223,7 +19298,7 @@
       <w:pPr>
         <w:pStyle w:val="Heading1"/>
       </w:pPr>
-      <w:bookmarkStart w:id="24" w:name="_Toc244023921"/>
+      <w:bookmarkStart w:id="24" w:name="_Toc244025430"/>
       <w:r>
         <w:rPr>
           <w:rFonts w:ascii="Times New Roman" w:eastAsia="黑体" w:hAnsi="Times New Roman" w:cs="Times New Roman"/>
@@ -20040,7 +20115,6 @@
         <w:rPr>
           <w:rFonts w:cs="Times New Roman"/>
         </w:rPr>
-        <w:lastRenderedPageBreak/>
         <w:t>完整输出见</w:t>
       </w:r>
       <w:r>
@@ -20130,11 +20204,12 @@
       <w:pPr>
         <w:pStyle w:val="Heading1"/>
       </w:pPr>
-      <w:bookmarkStart w:id="25" w:name="_Toc244023922"/>
+      <w:bookmarkStart w:id="25" w:name="_Toc244025431"/>
       <w:r>
         <w:rPr>
           <w:rFonts w:ascii="Times New Roman" w:eastAsia="黑体" w:hAnsi="Times New Roman" w:cs="Times New Roman"/>
         </w:rPr>
+        <w:lastRenderedPageBreak/>
         <w:t xml:space="preserve">9. </w:t>
       </w:r>
       <w:r>
@@ -20273,7 +20348,7 @@
       <w:pPr>
         <w:pStyle w:val="Heading2"/>
       </w:pPr>
-      <w:bookmarkStart w:id="26" w:name="_Toc244023923"/>
+      <w:bookmarkStart w:id="26" w:name="_Toc244025432"/>
       <w:r>
         <w:rPr>
           <w:rFonts w:ascii="Times New Roman" w:eastAsia="黑体" w:hAnsi="Times New Roman" w:cs="Times New Roman"/>
@@ -20372,7 +20447,7 @@
           <w:noProof/>
         </w:rPr>
         <w:drawing>
-          <wp:inline distT="0" distB="0" distL="0" distR="0" wp14:anchorId="0F62A1CA" wp14:editId="55E5831F">
+          <wp:inline distT="0" distB="0" distL="0" distR="0" wp14:anchorId="1B54666B" wp14:editId="0FE9E699">
             <wp:extent cx="4754880" cy="3343275"/>
             <wp:effectExtent l="0" t="0" r="0" b="0"/>
             <wp:docPr id="1" name="Picture 1"/>
@@ -20384,164 +20459,6 @@
                 <pic:pic xmlns:pic="http://schemas.openxmlformats.org/drawingml/2006/picture">
                   <pic:nvPicPr>
                     <pic:cNvPr id="0" name="phase2-question-library.png"/>
-                    <pic:cNvPicPr/>
-                  </pic:nvPicPr>
-                  <pic:blipFill>
-                    <a:blip r:embed="rId10"/>
-                    <a:stretch>
-                      <a:fillRect/>
-                    </a:stretch>
-                  </pic:blipFill>
-                  <pic:spPr>
-                    <a:xfrm>
-                      <a:off x="0" y="0"/>
-                      <a:ext cx="4754880" cy="3343275"/>
-                    </a:xfrm>
-                    <a:prstGeom prst="rect">
-                      <a:avLst/>
-                    </a:prstGeom>
-                  </pic:spPr>
-                </pic:pic>
-              </a:graphicData>
-            </a:graphic>
-          </wp:inline>
-        </w:drawing>
-      </w:r>
-    </w:p>
-    <w:p>
-      <w:pPr>
-        <w:pStyle w:val="af7"/>
-      </w:pPr>
-      <w:r>
-        <w:rPr>
-          <w:rFonts w:cs="Times New Roman"/>
-          <w:b w:val="0"/>
-        </w:rPr>
-        <w:t>图</w:t>
-      </w:r>
-      <w:r>
-        <w:rPr>
-          <w:rFonts w:cs="Times New Roman"/>
-          <w:b w:val="0"/>
-        </w:rPr>
-        <w:t xml:space="preserve"> 1 </w:t>
-      </w:r>
-      <w:r>
-        <w:rPr>
-          <w:rFonts w:cs="Times New Roman"/>
-          <w:b w:val="0"/>
-        </w:rPr>
-        <w:t>题目库列表：</w:t>
-      </w:r>
-      <w:r>
-        <w:rPr>
-          <w:rFonts w:cs="Times New Roman"/>
-          <w:b w:val="0"/>
-        </w:rPr>
-        <w:t xml:space="preserve">4 </w:t>
-      </w:r>
-      <w:r>
-        <w:rPr>
-          <w:rFonts w:cs="Times New Roman"/>
-          <w:b w:val="0"/>
-        </w:rPr>
-        <w:t>道题、版本数与跨问卷统计入口</w:t>
-      </w:r>
-    </w:p>
-    <w:p>
-      <w:pPr>
-        <w:pStyle w:val="Heading2"/>
-      </w:pPr>
-      <w:bookmarkStart w:id="27" w:name="_Toc244023924"/>
-      <w:r>
-        <w:rPr>
-          <w:rFonts w:ascii="Times New Roman" w:eastAsia="黑体" w:hAnsi="Times New Roman" w:cs="Times New Roman"/>
-        </w:rPr>
-        <w:t xml:space="preserve">9.2 </w:t>
-      </w:r>
-      <w:r>
-        <w:rPr>
-          <w:rFonts w:ascii="Times New Roman" w:eastAsia="黑体" w:hAnsi="Times New Roman" w:cs="Times New Roman"/>
-        </w:rPr>
-        <w:t>题目详情与共享</w:t>
-      </w:r>
-      <w:bookmarkEnd w:id="27"/>
-    </w:p>
-    <w:p>
-      <w:pPr>
-        <w:spacing w:after="80"/>
-        <w:jc w:val="both"/>
-      </w:pPr>
-      <w:r>
-        <w:rPr>
-          <w:rFonts w:cs="Times New Roman"/>
-        </w:rPr>
-        <w:t>题目详情页展示当前版本内容、共享对象、权限、派生和删除操作。被共享者只获得</w:t>
-      </w:r>
-      <w:r>
-        <w:rPr>
-          <w:rFonts w:cs="Times New Roman"/>
-        </w:rPr>
-        <w:t xml:space="preserve"> </w:t>
-      </w:r>
-      <w:r>
-        <w:rPr>
-          <w:rFonts w:ascii="Courier New" w:hAnsi="Courier New" w:cs="Courier New"/>
-          <w:color w:val="1F1F1F"/>
-          <w:sz w:val="22"/>
-        </w:rPr>
-        <w:t>use</w:t>
-      </w:r>
-      <w:r>
-        <w:rPr>
-          <w:rFonts w:cs="Times New Roman"/>
-        </w:rPr>
-        <w:t xml:space="preserve"> </w:t>
-      </w:r>
-      <w:r>
-        <w:rPr>
-          <w:rFonts w:cs="Times New Roman"/>
-        </w:rPr>
-        <w:t>权限，不能改题；删除按钮对已发布问卷引用的题目会被服务端拒绝（</w:t>
-      </w:r>
-      <w:r>
-        <w:rPr>
-          <w:rFonts w:cs="Times New Roman"/>
-        </w:rPr>
-        <w:t>I5</w:t>
-      </w:r>
-      <w:r>
-        <w:rPr>
-          <w:rFonts w:cs="Times New Roman"/>
-        </w:rPr>
-        <w:t>）。</w:t>
-      </w:r>
-    </w:p>
-    <w:p>
-      <w:pPr>
-        <w:keepNext/>
-        <w:spacing w:before="160" w:after="40"/>
-        <w:ind w:firstLine="0"/>
-        <w:jc w:val="center"/>
-      </w:pPr>
-      <w:r>
-        <w:rPr>
-          <w:noProof/>
-        </w:rPr>
-        <w:lastRenderedPageBreak/>
-        <w:drawing>
-          <wp:inline distT="0" distB="0" distL="0" distR="0" wp14:anchorId="60E413B4" wp14:editId="28D4B942">
-            <wp:extent cx="4754880" cy="3343275"/>
-            <wp:effectExtent l="0" t="0" r="0" b="0"/>
-            <wp:docPr id="2" name="Picture 2"/>
-            <wp:cNvGraphicFramePr>
-              <a:graphicFrameLocks xmlns:a="http://schemas.openxmlformats.org/drawingml/2006/main" noChangeAspect="1"/>
-            </wp:cNvGraphicFramePr>
-            <a:graphic xmlns:a="http://schemas.openxmlformats.org/drawingml/2006/main">
-              <a:graphicData uri="http://schemas.openxmlformats.org/drawingml/2006/picture">
-                <pic:pic xmlns:pic="http://schemas.openxmlformats.org/drawingml/2006/picture">
-                  <pic:nvPicPr>
-                    <pic:cNvPr id="0" name="phase2-question-detail.png"/>
                     <pic:cNvPicPr/>
                   </pic:nvPicPr>
                   <pic:blipFill>
@@ -20582,34 +20499,48 @@
           <w:rFonts w:cs="Times New Roman"/>
           <w:b w:val="0"/>
         </w:rPr>
-        <w:t xml:space="preserve"> 2 </w:t>
+        <w:t xml:space="preserve"> 1 </w:t>
       </w:r>
       <w:r>
         <w:rPr>
           <w:rFonts w:cs="Times New Roman"/>
           <w:b w:val="0"/>
         </w:rPr>
-        <w:t>题目详情：当前版本、共享权限与操作入口</w:t>
+        <w:t>题目库列表：</w:t>
+      </w:r>
+      <w:r>
+        <w:rPr>
+          <w:rFonts w:cs="Times New Roman"/>
+          <w:b w:val="0"/>
+        </w:rPr>
+        <w:t xml:space="preserve">4 </w:t>
+      </w:r>
+      <w:r>
+        <w:rPr>
+          <w:rFonts w:cs="Times New Roman"/>
+          <w:b w:val="0"/>
+        </w:rPr>
+        <w:t>道题、版本数与跨问卷统计入口</w:t>
       </w:r>
     </w:p>
     <w:p>
       <w:pPr>
         <w:pStyle w:val="Heading2"/>
       </w:pPr>
-      <w:bookmarkStart w:id="28" w:name="_Toc244023925"/>
+      <w:bookmarkStart w:id="27" w:name="_Toc244025433"/>
       <w:r>
         <w:rPr>
           <w:rFonts w:ascii="Times New Roman" w:eastAsia="黑体" w:hAnsi="Times New Roman" w:cs="Times New Roman"/>
         </w:rPr>
-        <w:t xml:space="preserve">9.3 </w:t>
+        <w:t xml:space="preserve">9.2 </w:t>
       </w:r>
       <w:r>
         <w:rPr>
           <w:rFonts w:ascii="Times New Roman" w:eastAsia="黑体" w:hAnsi="Times New Roman" w:cs="Times New Roman"/>
         </w:rPr>
-        <w:t>版本历史与反向引用</w:t>
-      </w:r>
-      <w:bookmarkEnd w:id="28"/>
+        <w:t>题目详情与共享</w:t>
+      </w:r>
+      <w:bookmarkEnd w:id="27"/>
     </w:p>
     <w:p>
       <w:pPr>
@@ -20620,7 +20551,7 @@
         <w:rPr>
           <w:rFonts w:cs="Times New Roman"/>
         </w:rPr>
-        <w:t>同一页面的下半部分把</w:t>
+        <w:t>题目详情页展示当前版本内容、共享对象、权限、派生和删除操作。顶部同时提供</w:t>
       </w:r>
       <w:r>
         <w:rPr>
@@ -20632,7 +20563,7 @@
         <w:rPr>
           <w:rFonts w:cs="Times New Roman"/>
         </w:rPr>
-        <w:t>版本历史</w:t>
+        <w:t>改题（生成新版本）</w:t>
       </w:r>
       <w:r>
         <w:rPr>
@@ -20656,7 +20587,7 @@
         <w:rPr>
           <w:rFonts w:cs="Times New Roman"/>
         </w:rPr>
-        <w:t>被哪些问卷使用</w:t>
+        <w:t>派生为新题目</w:t>
       </w:r>
       <w:r>
         <w:rPr>
@@ -20668,7 +20599,7 @@
         <w:rPr>
           <w:rFonts w:cs="Times New Roman"/>
         </w:rPr>
-        <w:t>放在一起。版本链按</w:t>
+        <w:t>，用于在保留题目实体与创建新实体之间做选择。被共享者只获得</w:t>
       </w:r>
       <w:r>
         <w:rPr>
@@ -20682,7 +20613,7 @@
           <w:color w:val="1F1F1F"/>
           <w:sz w:val="22"/>
         </w:rPr>
-        <w:t>v1 → v2</w:t>
+        <w:t>use</w:t>
       </w:r>
       <w:r>
         <w:rPr>
@@ -20694,31 +20625,19 @@
         <w:rPr>
           <w:rFonts w:cs="Times New Roman"/>
         </w:rPr>
-        <w:t>展示，旧版本可以恢复；使用列表显示问卷标题、问卷版本、题目实例、题目版本和发布状态。这是</w:t>
-      </w:r>
-      <w:r>
-        <w:rPr>
-          <w:rFonts w:cs="Times New Roman"/>
-        </w:rPr>
-        <w:t xml:space="preserve"> R4 </w:t>
-      </w:r>
-      <w:r>
-        <w:rPr>
-          <w:rFonts w:cs="Times New Roman"/>
-        </w:rPr>
-        <w:t>与</w:t>
-      </w:r>
-      <w:r>
-        <w:rPr>
-          <w:rFonts w:cs="Times New Roman"/>
-        </w:rPr>
-        <w:t xml:space="preserve"> R6 </w:t>
-      </w:r>
-      <w:r>
-        <w:rPr>
-          <w:rFonts w:cs="Times New Roman"/>
-        </w:rPr>
-        <w:t>的界面证据。</w:t>
+        <w:t>权限，不能改题；删除按钮对已发布问卷引用的题目会被服务端拒绝（</w:t>
+      </w:r>
+      <w:r>
+        <w:rPr>
+          <w:rFonts w:cs="Times New Roman"/>
+        </w:rPr>
+        <w:t>I5</w:t>
+      </w:r>
+      <w:r>
+        <w:rPr>
+          <w:rFonts w:cs="Times New Roman"/>
+        </w:rPr>
+        <w:t>）。</w:t>
       </w:r>
     </w:p>
     <w:p>
@@ -20732,11 +20651,12 @@
         <w:rPr>
           <w:noProof/>
         </w:rPr>
+        <w:lastRenderedPageBreak/>
         <w:drawing>
-          <wp:inline distT="0" distB="0" distL="0" distR="0" wp14:anchorId="03D3DCCA" wp14:editId="71C9F39E">
+          <wp:inline distT="0" distB="0" distL="0" distR="0" wp14:anchorId="1B4044C1" wp14:editId="0B9A4EAF">
             <wp:extent cx="4754880" cy="3343275"/>
             <wp:effectExtent l="0" t="0" r="0" b="0"/>
-            <wp:docPr id="3" name="Picture 3"/>
+            <wp:docPr id="2" name="Picture 2"/>
             <wp:cNvGraphicFramePr>
               <a:graphicFrameLocks xmlns:a="http://schemas.openxmlformats.org/drawingml/2006/main" noChangeAspect="1"/>
             </wp:cNvGraphicFramePr>
@@ -20744,7 +20664,7 @@
               <a:graphicData uri="http://schemas.openxmlformats.org/drawingml/2006/picture">
                 <pic:pic xmlns:pic="http://schemas.openxmlformats.org/drawingml/2006/picture">
                   <pic:nvPicPr>
-                    <pic:cNvPr id="0" name="phase2-question-versions.png"/>
+                    <pic:cNvPr id="0" name="phase2-question-detail.png"/>
                     <pic:cNvPicPr/>
                   </pic:nvPicPr>
                   <pic:blipFill>
@@ -20785,49 +20705,34 @@
           <w:rFonts w:cs="Times New Roman"/>
           <w:b w:val="0"/>
         </w:rPr>
-        <w:t xml:space="preserve"> 3 </w:t>
+        <w:t xml:space="preserve"> 2 </w:t>
       </w:r>
       <w:r>
         <w:rPr>
           <w:rFonts w:cs="Times New Roman"/>
           <w:b w:val="0"/>
         </w:rPr>
-        <w:t>版本历史与反向引用：</w:t>
-      </w:r>
-      <w:r>
-        <w:rPr>
-          <w:rFonts w:cs="Times New Roman"/>
-          <w:b w:val="0"/>
-        </w:rPr>
-        <w:t xml:space="preserve">v1→v2 </w:t>
-      </w:r>
-      <w:r>
-        <w:rPr>
-          <w:rFonts w:cs="Times New Roman"/>
-          <w:b w:val="0"/>
-        </w:rPr>
-        <w:t>链和两份问卷的使用情况</w:t>
+        <w:t>题目详情：当前版本、共享权限与操作入口</w:t>
       </w:r>
     </w:p>
     <w:p>
       <w:pPr>
         <w:pStyle w:val="Heading2"/>
       </w:pPr>
-      <w:bookmarkStart w:id="29" w:name="_Toc244023926"/>
+      <w:bookmarkStart w:id="28" w:name="_Toc244025434"/>
       <w:r>
         <w:rPr>
           <w:rFonts w:ascii="Times New Roman" w:eastAsia="黑体" w:hAnsi="Times New Roman" w:cs="Times New Roman"/>
         </w:rPr>
-        <w:lastRenderedPageBreak/>
-        <w:t xml:space="preserve">9.4 </w:t>
+        <w:t xml:space="preserve">9.3 </w:t>
       </w:r>
       <w:r>
         <w:rPr>
           <w:rFonts w:ascii="Times New Roman" w:eastAsia="黑体" w:hAnsi="Times New Roman" w:cs="Times New Roman"/>
         </w:rPr>
-        <w:t>编辑器中的题库集成</w:t>
-      </w:r>
-      <w:bookmarkEnd w:id="29"/>
+        <w:t>版本历史与反向引用</w:t>
+      </w:r>
+      <w:bookmarkEnd w:id="28"/>
     </w:p>
     <w:p>
       <w:pPr>
@@ -20838,7 +20743,7 @@
         <w:rPr>
           <w:rFonts w:cs="Times New Roman"/>
         </w:rPr>
-        <w:t>编辑器中的题库题带</w:t>
+        <w:t>同一页面的下半部分把</w:t>
       </w:r>
       <w:r>
         <w:rPr>
@@ -20850,7 +20755,7 @@
         <w:rPr>
           <w:rFonts w:cs="Times New Roman"/>
         </w:rPr>
-        <w:t>题库</w:t>
+        <w:t>版本历史</w:t>
       </w:r>
       <w:r>
         <w:rPr>
@@ -20862,7 +20767,7 @@
         <w:rPr>
           <w:rFonts w:cs="Times New Roman"/>
         </w:rPr>
-        <w:t>标记，并提供</w:t>
+        <w:t>和</w:t>
       </w:r>
       <w:r>
         <w:rPr>
@@ -20874,7 +20779,7 @@
         <w:rPr>
           <w:rFonts w:cs="Times New Roman"/>
         </w:rPr>
-        <w:t>更新到最新版本</w:t>
+        <w:t>被哪些问卷使用</w:t>
       </w:r>
       <w:r>
         <w:rPr>
@@ -20886,55 +20791,57 @@
         <w:rPr>
           <w:rFonts w:cs="Times New Roman"/>
         </w:rPr>
-        <w:t>。已发布问卷处于只读状态，题目内容和跳转规则被冻结；修改需要发布新版本。这个页面同时验证了</w:t>
-      </w:r>
-      <w:r>
-        <w:rPr>
-          <w:rFonts w:cs="Times New Roman"/>
-        </w:rPr>
-        <w:t>“</w:t>
-      </w:r>
-      <w:r>
-        <w:rPr>
-          <w:rFonts w:cs="Times New Roman"/>
-        </w:rPr>
-        <w:t>从题库插入</w:t>
-      </w:r>
-      <w:r>
-        <w:rPr>
-          <w:rFonts w:cs="Times New Roman"/>
-        </w:rPr>
-        <w:t>”</w:t>
-      </w:r>
-      <w:r>
-        <w:rPr>
-          <w:rFonts w:cs="Times New Roman"/>
-        </w:rPr>
-        <w:t>和</w:t>
-      </w:r>
-      <w:r>
-        <w:rPr>
-          <w:rFonts w:cs="Times New Roman"/>
-        </w:rPr>
-        <w:t>“</w:t>
-      </w:r>
-      <w:r>
-        <w:rPr>
-          <w:rFonts w:cs="Times New Roman"/>
-        </w:rPr>
-        <w:t>版本升级</w:t>
-      </w:r>
-      <w:r>
-        <w:rPr>
-          <w:rFonts w:cs="Times New Roman"/>
-        </w:rPr>
-        <w:t>”</w:t>
-      </w:r>
-      <w:r>
-        <w:rPr>
-          <w:rFonts w:cs="Times New Roman"/>
-        </w:rPr>
-        <w:t>两个入口。</w:t>
+        <w:t>放在一起。版本链按</w:t>
+      </w:r>
+      <w:r>
+        <w:rPr>
+          <w:rFonts w:cs="Times New Roman"/>
+        </w:rPr>
+        <w:t xml:space="preserve"> </w:t>
+      </w:r>
+      <w:r>
+        <w:rPr>
+          <w:rFonts w:ascii="Courier New" w:hAnsi="Courier New" w:cs="Courier New"/>
+          <w:color w:val="1F1F1F"/>
+          <w:sz w:val="22"/>
+        </w:rPr>
+        <w:t>v1 → v2</w:t>
+      </w:r>
+      <w:r>
+        <w:rPr>
+          <w:rFonts w:cs="Times New Roman"/>
+        </w:rPr>
+        <w:t xml:space="preserve"> </w:t>
+      </w:r>
+      <w:r>
+        <w:rPr>
+          <w:rFonts w:cs="Times New Roman"/>
+        </w:rPr>
+        <w:t>展示，旧版本可以恢复；使用列表显示问卷标题、问卷版本、题目实例、题目版本和发布状态。这是</w:t>
+      </w:r>
+      <w:r>
+        <w:rPr>
+          <w:rFonts w:cs="Times New Roman"/>
+        </w:rPr>
+        <w:t xml:space="preserve"> R4 </w:t>
+      </w:r>
+      <w:r>
+        <w:rPr>
+          <w:rFonts w:cs="Times New Roman"/>
+        </w:rPr>
+        <w:t>与</w:t>
+      </w:r>
+      <w:r>
+        <w:rPr>
+          <w:rFonts w:cs="Times New Roman"/>
+        </w:rPr>
+        <w:t xml:space="preserve"> R6 </w:t>
+      </w:r>
+      <w:r>
+        <w:rPr>
+          <w:rFonts w:cs="Times New Roman"/>
+        </w:rPr>
+        <w:t>的界面证据。</w:t>
       </w:r>
     </w:p>
     <w:p>
@@ -20949,10 +20856,10 @@
           <w:noProof/>
         </w:rPr>
         <w:drawing>
-          <wp:inline distT="0" distB="0" distL="0" distR="0" wp14:anchorId="6B93E41D" wp14:editId="23A32625">
+          <wp:inline distT="0" distB="0" distL="0" distR="0" wp14:anchorId="39C95200" wp14:editId="7B5B9197">
             <wp:extent cx="4754880" cy="3343275"/>
             <wp:effectExtent l="0" t="0" r="0" b="0"/>
-            <wp:docPr id="4" name="Picture 4"/>
+            <wp:docPr id="3" name="Picture 3"/>
             <wp:cNvGraphicFramePr>
               <a:graphicFrameLocks xmlns:a="http://schemas.openxmlformats.org/drawingml/2006/main" noChangeAspect="1"/>
             </wp:cNvGraphicFramePr>
@@ -20960,7 +20867,7 @@
               <a:graphicData uri="http://schemas.openxmlformats.org/drawingml/2006/picture">
                 <pic:pic xmlns:pic="http://schemas.openxmlformats.org/drawingml/2006/picture">
                   <pic:nvPicPr>
-                    <pic:cNvPr id="0" name="phase2-editor.png"/>
+                    <pic:cNvPr id="0" name="phase2-question-versions.png"/>
                     <pic:cNvPicPr/>
                   </pic:nvPicPr>
                   <pic:blipFill>
@@ -21001,34 +20908,49 @@
           <w:rFonts w:cs="Times New Roman"/>
           <w:b w:val="0"/>
         </w:rPr>
-        <w:t xml:space="preserve"> 4 </w:t>
+        <w:t xml:space="preserve"> 3 </w:t>
       </w:r>
       <w:r>
         <w:rPr>
           <w:rFonts w:cs="Times New Roman"/>
           <w:b w:val="0"/>
         </w:rPr>
-        <w:t>编辑器中的题库题与更新到最新版本入口</w:t>
+        <w:t>版本历史与反向引用：</w:t>
+      </w:r>
+      <w:r>
+        <w:rPr>
+          <w:rFonts w:cs="Times New Roman"/>
+          <w:b w:val="0"/>
+        </w:rPr>
+        <w:t xml:space="preserve">v1→v2 </w:t>
+      </w:r>
+      <w:r>
+        <w:rPr>
+          <w:rFonts w:cs="Times New Roman"/>
+          <w:b w:val="0"/>
+        </w:rPr>
+        <w:t>链和两份问卷的使用情况</w:t>
       </w:r>
     </w:p>
     <w:p>
       <w:pPr>
         <w:pStyle w:val="Heading2"/>
       </w:pPr>
-      <w:bookmarkStart w:id="30" w:name="_Toc244023927"/>
+      <w:bookmarkStart w:id="29" w:name="_Toc244025435"/>
       <w:r>
         <w:rPr>
           <w:rFonts w:ascii="Times New Roman" w:eastAsia="黑体" w:hAnsi="Times New Roman" w:cs="Times New Roman"/>
         </w:rPr>
-        <w:t xml:space="preserve">9.5 </w:t>
+        <w:lastRenderedPageBreak/>
+        <w:t xml:space="preserve">9.4 </w:t>
       </w:r>
       <w:r>
         <w:rPr>
           <w:rFonts w:ascii="Times New Roman" w:eastAsia="黑体" w:hAnsi="Times New Roman" w:cs="Times New Roman"/>
         </w:rPr>
-        <w:t>题库详情</w:t>
-      </w:r>
-      <w:bookmarkEnd w:id="30"/>
+        <w:t>编辑器中的题库集成</w:t>
+      </w:r>
+      <w:bookmarkEnd w:id="29"/>
     </w:p>
     <w:p>
       <w:pPr>
@@ -21039,7 +20961,103 @@
         <w:rPr>
           <w:rFonts w:cs="Times New Roman"/>
         </w:rPr>
-        <w:t>题库详情页展示题库条目、备注和题库操作。题库条目引用题目实体而不是固定版本，因此题目升级后，从题库取到的是最新版本；题目本身仍可独立维护。</w:t>
+        <w:t>编辑器中的题库题带</w:t>
+      </w:r>
+      <w:r>
+        <w:rPr>
+          <w:rFonts w:cs="Times New Roman"/>
+        </w:rPr>
+        <w:t>“</w:t>
+      </w:r>
+      <w:r>
+        <w:rPr>
+          <w:rFonts w:cs="Times New Roman"/>
+        </w:rPr>
+        <w:t>题库</w:t>
+      </w:r>
+      <w:r>
+        <w:rPr>
+          <w:rFonts w:cs="Times New Roman"/>
+        </w:rPr>
+        <w:t>”</w:t>
+      </w:r>
+      <w:r>
+        <w:rPr>
+          <w:rFonts w:cs="Times New Roman"/>
+        </w:rPr>
+        <w:t>标记，并提供</w:t>
+      </w:r>
+      <w:r>
+        <w:rPr>
+          <w:rFonts w:cs="Times New Roman"/>
+        </w:rPr>
+        <w:t>“</w:t>
+      </w:r>
+      <w:r>
+        <w:rPr>
+          <w:rFonts w:cs="Times New Roman"/>
+        </w:rPr>
+        <w:t>更新到最新版本</w:t>
+      </w:r>
+      <w:r>
+        <w:rPr>
+          <w:rFonts w:cs="Times New Roman"/>
+        </w:rPr>
+        <w:t>”</w:t>
+      </w:r>
+      <w:r>
+        <w:rPr>
+          <w:rFonts w:cs="Times New Roman"/>
+        </w:rPr>
+        <w:t>。已发布问卷处于只读状态，题目内容和跳转规则被冻结；修改需要发布新版本。这个页面同时验证了</w:t>
+      </w:r>
+      <w:r>
+        <w:rPr>
+          <w:rFonts w:cs="Times New Roman"/>
+        </w:rPr>
+        <w:t>“</w:t>
+      </w:r>
+      <w:r>
+        <w:rPr>
+          <w:rFonts w:cs="Times New Roman"/>
+        </w:rPr>
+        <w:t>从题库插入</w:t>
+      </w:r>
+      <w:r>
+        <w:rPr>
+          <w:rFonts w:cs="Times New Roman"/>
+        </w:rPr>
+        <w:t>”</w:t>
+      </w:r>
+      <w:r>
+        <w:rPr>
+          <w:rFonts w:cs="Times New Roman"/>
+        </w:rPr>
+        <w:t>和</w:t>
+      </w:r>
+      <w:r>
+        <w:rPr>
+          <w:rFonts w:cs="Times New Roman"/>
+        </w:rPr>
+        <w:t>“</w:t>
+      </w:r>
+      <w:r>
+        <w:rPr>
+          <w:rFonts w:cs="Times New Roman"/>
+        </w:rPr>
+        <w:t>版本升级</w:t>
+      </w:r>
+      <w:r>
+        <w:rPr>
+          <w:rFonts w:cs="Times New Roman"/>
+        </w:rPr>
+        <w:t>”</w:t>
+      </w:r>
+      <w:r>
+        <w:rPr>
+          <w:rFonts w:cs="Times New Roman"/>
+        </w:rPr>
+        <w:t>两个入口。</w:t>
       </w:r>
     </w:p>
     <w:p>
@@ -21053,12 +21071,11 @@
         <w:rPr>
           <w:noProof/>
         </w:rPr>
-        <w:lastRenderedPageBreak/>
         <w:drawing>
-          <wp:inline distT="0" distB="0" distL="0" distR="0" wp14:anchorId="44FB2BCA" wp14:editId="72CBAFC2">
+          <wp:inline distT="0" distB="0" distL="0" distR="0" wp14:anchorId="02ED503C" wp14:editId="652BC35E">
             <wp:extent cx="4754880" cy="3343275"/>
             <wp:effectExtent l="0" t="0" r="0" b="0"/>
-            <wp:docPr id="5" name="Picture 5"/>
+            <wp:docPr id="4" name="Picture 4"/>
             <wp:cNvGraphicFramePr>
               <a:graphicFrameLocks xmlns:a="http://schemas.openxmlformats.org/drawingml/2006/main" noChangeAspect="1"/>
             </wp:cNvGraphicFramePr>
@@ -21066,7 +21083,7 @@
               <a:graphicData uri="http://schemas.openxmlformats.org/drawingml/2006/picture">
                 <pic:pic xmlns:pic="http://schemas.openxmlformats.org/drawingml/2006/picture">
                   <pic:nvPicPr>
-                    <pic:cNvPr id="0" name="phase2-question-book.png"/>
+                    <pic:cNvPr id="0" name="phase2-editor.png"/>
                     <pic:cNvPicPr/>
                   </pic:nvPicPr>
                   <pic:blipFill>
@@ -21107,34 +21124,34 @@
           <w:rFonts w:cs="Times New Roman"/>
           <w:b w:val="0"/>
         </w:rPr>
-        <w:t xml:space="preserve"> 5 </w:t>
+        <w:t xml:space="preserve"> 4 </w:t>
       </w:r>
       <w:r>
         <w:rPr>
           <w:rFonts w:cs="Times New Roman"/>
           <w:b w:val="0"/>
         </w:rPr>
-        <w:t>题库详情：条目引用题目实体</w:t>
+        <w:t>编辑器中的题库题与更新到最新版本入口</w:t>
       </w:r>
     </w:p>
     <w:p>
       <w:pPr>
         <w:pStyle w:val="Heading2"/>
       </w:pPr>
-      <w:bookmarkStart w:id="31" w:name="_Toc244023928"/>
+      <w:bookmarkStart w:id="30" w:name="_Toc244025436"/>
       <w:r>
         <w:rPr>
           <w:rFonts w:ascii="Times New Roman" w:eastAsia="黑体" w:hAnsi="Times New Roman" w:cs="Times New Roman"/>
         </w:rPr>
-        <w:t xml:space="preserve">9.6 </w:t>
+        <w:t xml:space="preserve">9.5 </w:t>
       </w:r>
       <w:r>
         <w:rPr>
           <w:rFonts w:ascii="Times New Roman" w:eastAsia="黑体" w:hAnsi="Times New Roman" w:cs="Times New Roman"/>
         </w:rPr>
-        <w:t>跨问卷统计</w:t>
-      </w:r>
-      <w:bookmarkEnd w:id="31"/>
+        <w:t>题库详情</w:t>
+      </w:r>
+      <w:bookmarkEnd w:id="30"/>
     </w:p>
     <w:p>
       <w:pPr>
@@ -21145,79 +21162,7 @@
         <w:rPr>
           <w:rFonts w:cs="Times New Roman"/>
         </w:rPr>
-        <w:t>跨问卷统计页按题目实体聚合，展示作答数、涉及问卷、题目版本、均值</w:t>
-      </w:r>
-      <w:r>
-        <w:rPr>
-          <w:rFonts w:cs="Times New Roman"/>
-        </w:rPr>
-        <w:t>/</w:t>
-      </w:r>
-      <w:r>
-        <w:rPr>
-          <w:rFonts w:cs="Times New Roman"/>
-        </w:rPr>
-        <w:t>最值、版本分布和选项频次。演示数据为</w:t>
-      </w:r>
-      <w:r>
-        <w:rPr>
-          <w:rFonts w:cs="Times New Roman"/>
-        </w:rPr>
-        <w:t xml:space="preserve"> 3 </w:t>
-      </w:r>
-      <w:r>
-        <w:rPr>
-          <w:rFonts w:cs="Times New Roman"/>
-        </w:rPr>
-        <w:t>份答卷、</w:t>
-      </w:r>
-      <w:r>
-        <w:rPr>
-          <w:rFonts w:cs="Times New Roman"/>
-        </w:rPr>
-        <w:t xml:space="preserve">2 </w:t>
-      </w:r>
-      <w:r>
-        <w:rPr>
-          <w:rFonts w:cs="Times New Roman"/>
-        </w:rPr>
-        <w:t>份问卷、均值</w:t>
-      </w:r>
-      <w:r>
-        <w:rPr>
-          <w:rFonts w:cs="Times New Roman"/>
-        </w:rPr>
-        <w:t xml:space="preserve"> 30</w:t>
-      </w:r>
-      <w:r>
-        <w:rPr>
-          <w:rFonts w:cs="Times New Roman"/>
-        </w:rPr>
-        <w:t>、最小值</w:t>
-      </w:r>
-      <w:r>
-        <w:rPr>
-          <w:rFonts w:cs="Times New Roman"/>
-        </w:rPr>
-        <w:t xml:space="preserve"> 20</w:t>
-      </w:r>
-      <w:r>
-        <w:rPr>
-          <w:rFonts w:cs="Times New Roman"/>
-        </w:rPr>
-        <w:t>、最大值</w:t>
-      </w:r>
-      <w:r>
-        <w:rPr>
-          <w:rFonts w:cs="Times New Roman"/>
-        </w:rPr>
-        <w:t xml:space="preserve"> 40</w:t>
-      </w:r>
-      <w:r>
-        <w:rPr>
-          <w:rFonts w:cs="Times New Roman"/>
-        </w:rPr>
-        <w:t>。</w:t>
+        <w:t>题库详情页展示题库条目、备注和题库操作。题库条目引用题目实体而不是固定版本，因此题目升级后，从题库取到的是最新版本；题目本身仍可独立维护。</w:t>
       </w:r>
     </w:p>
     <w:p>
@@ -21231,11 +21176,12 @@
         <w:rPr>
           <w:noProof/>
         </w:rPr>
+        <w:lastRenderedPageBreak/>
         <w:drawing>
-          <wp:inline distT="0" distB="0" distL="0" distR="0" wp14:anchorId="0B229B58" wp14:editId="49AE27CE">
+          <wp:inline distT="0" distB="0" distL="0" distR="0" wp14:anchorId="5AF2E87B" wp14:editId="33CDA6C7">
             <wp:extent cx="4754880" cy="3343275"/>
             <wp:effectExtent l="0" t="0" r="0" b="0"/>
-            <wp:docPr id="6" name="Picture 6"/>
+            <wp:docPr id="5" name="Picture 5"/>
             <wp:cNvGraphicFramePr>
               <a:graphicFrameLocks xmlns:a="http://schemas.openxmlformats.org/drawingml/2006/main" noChangeAspect="1"/>
             </wp:cNvGraphicFramePr>
@@ -21243,7 +21189,7 @@
               <a:graphicData uri="http://schemas.openxmlformats.org/drawingml/2006/picture">
                 <pic:pic xmlns:pic="http://schemas.openxmlformats.org/drawingml/2006/picture">
                   <pic:nvPicPr>
-                    <pic:cNvPr id="0" name="phase2-cross-survey-stats.png"/>
+                    <pic:cNvPr id="0" name="phase2-question-book.png"/>
                     <pic:cNvPicPr/>
                   </pic:nvPicPr>
                   <pic:blipFill>
@@ -21284,6 +21230,183 @@
           <w:rFonts w:cs="Times New Roman"/>
           <w:b w:val="0"/>
         </w:rPr>
+        <w:t xml:space="preserve"> 5 </w:t>
+      </w:r>
+      <w:r>
+        <w:rPr>
+          <w:rFonts w:cs="Times New Roman"/>
+          <w:b w:val="0"/>
+        </w:rPr>
+        <w:t>题库详情：条目引用题目实体</w:t>
+      </w:r>
+    </w:p>
+    <w:p>
+      <w:pPr>
+        <w:pStyle w:val="Heading2"/>
+      </w:pPr>
+      <w:bookmarkStart w:id="31" w:name="_Toc244025437"/>
+      <w:r>
+        <w:rPr>
+          <w:rFonts w:ascii="Times New Roman" w:eastAsia="黑体" w:hAnsi="Times New Roman" w:cs="Times New Roman"/>
+        </w:rPr>
+        <w:t xml:space="preserve">9.6 </w:t>
+      </w:r>
+      <w:r>
+        <w:rPr>
+          <w:rFonts w:ascii="Times New Roman" w:eastAsia="黑体" w:hAnsi="Times New Roman" w:cs="Times New Roman"/>
+        </w:rPr>
+        <w:t>跨问卷统计</w:t>
+      </w:r>
+      <w:bookmarkEnd w:id="31"/>
+    </w:p>
+    <w:p>
+      <w:pPr>
+        <w:spacing w:after="80"/>
+        <w:jc w:val="both"/>
+      </w:pPr>
+      <w:r>
+        <w:rPr>
+          <w:rFonts w:cs="Times New Roman"/>
+        </w:rPr>
+        <w:t>跨问卷统计页按题目实体聚合，展示作答数、涉及问卷、题目版本、均值</w:t>
+      </w:r>
+      <w:r>
+        <w:rPr>
+          <w:rFonts w:cs="Times New Roman"/>
+        </w:rPr>
+        <w:t>/</w:t>
+      </w:r>
+      <w:r>
+        <w:rPr>
+          <w:rFonts w:cs="Times New Roman"/>
+        </w:rPr>
+        <w:t>最值、版本分布和选项频次。演示数据为</w:t>
+      </w:r>
+      <w:r>
+        <w:rPr>
+          <w:rFonts w:cs="Times New Roman"/>
+        </w:rPr>
+        <w:t xml:space="preserve"> 3 </w:t>
+      </w:r>
+      <w:r>
+        <w:rPr>
+          <w:rFonts w:cs="Times New Roman"/>
+        </w:rPr>
+        <w:t>份答卷、</w:t>
+      </w:r>
+      <w:r>
+        <w:rPr>
+          <w:rFonts w:cs="Times New Roman"/>
+        </w:rPr>
+        <w:t xml:space="preserve">2 </w:t>
+      </w:r>
+      <w:r>
+        <w:rPr>
+          <w:rFonts w:cs="Times New Roman"/>
+        </w:rPr>
+        <w:t>份问卷、均值</w:t>
+      </w:r>
+      <w:r>
+        <w:rPr>
+          <w:rFonts w:cs="Times New Roman"/>
+        </w:rPr>
+        <w:t xml:space="preserve"> 30</w:t>
+      </w:r>
+      <w:r>
+        <w:rPr>
+          <w:rFonts w:cs="Times New Roman"/>
+        </w:rPr>
+        <w:t>、最小值</w:t>
+      </w:r>
+      <w:r>
+        <w:rPr>
+          <w:rFonts w:cs="Times New Roman"/>
+        </w:rPr>
+        <w:t xml:space="preserve"> 20</w:t>
+      </w:r>
+      <w:r>
+        <w:rPr>
+          <w:rFonts w:cs="Times New Roman"/>
+        </w:rPr>
+        <w:t>、最大值</w:t>
+      </w:r>
+      <w:r>
+        <w:rPr>
+          <w:rFonts w:cs="Times New Roman"/>
+        </w:rPr>
+        <w:t xml:space="preserve"> 40</w:t>
+      </w:r>
+      <w:r>
+        <w:rPr>
+          <w:rFonts w:cs="Times New Roman"/>
+        </w:rPr>
+        <w:t>。</w:t>
+      </w:r>
+    </w:p>
+    <w:p>
+      <w:pPr>
+        <w:keepNext/>
+        <w:spacing w:before="160" w:after="40"/>
+        <w:ind w:firstLine="0"/>
+        <w:jc w:val="center"/>
+      </w:pPr>
+      <w:r>
+        <w:rPr>
+          <w:noProof/>
+        </w:rPr>
+        <w:drawing>
+          <wp:inline distT="0" distB="0" distL="0" distR="0" wp14:anchorId="7383EFF0" wp14:editId="2798CD9D">
+            <wp:extent cx="4754880" cy="3343275"/>
+            <wp:effectExtent l="0" t="0" r="0" b="0"/>
+            <wp:docPr id="6" name="Picture 6"/>
+            <wp:cNvGraphicFramePr>
+              <a:graphicFrameLocks xmlns:a="http://schemas.openxmlformats.org/drawingml/2006/main" noChangeAspect="1"/>
+            </wp:cNvGraphicFramePr>
+            <a:graphic xmlns:a="http://schemas.openxmlformats.org/drawingml/2006/main">
+              <a:graphicData uri="http://schemas.openxmlformats.org/drawingml/2006/picture">
+                <pic:pic xmlns:pic="http://schemas.openxmlformats.org/drawingml/2006/picture">
+                  <pic:nvPicPr>
+                    <pic:cNvPr id="0" name="phase2-cross-survey-stats.png"/>
+                    <pic:cNvPicPr/>
+                  </pic:nvPicPr>
+                  <pic:blipFill>
+                    <a:blip r:embed="rId16"/>
+                    <a:stretch>
+                      <a:fillRect/>
+                    </a:stretch>
+                  </pic:blipFill>
+                  <pic:spPr>
+                    <a:xfrm>
+                      <a:off x="0" y="0"/>
+                      <a:ext cx="4754880" cy="3343275"/>
+                    </a:xfrm>
+                    <a:prstGeom prst="rect">
+                      <a:avLst/>
+                    </a:prstGeom>
+                  </pic:spPr>
+                </pic:pic>
+              </a:graphicData>
+            </a:graphic>
+          </wp:inline>
+        </w:drawing>
+      </w:r>
+    </w:p>
+    <w:p>
+      <w:pPr>
+        <w:pStyle w:val="af7"/>
+      </w:pPr>
+      <w:r>
+        <w:rPr>
+          <w:rFonts w:cs="Times New Roman"/>
+          <w:b w:val="0"/>
+        </w:rPr>
+        <w:t>图</w:t>
+      </w:r>
+      <w:r>
+        <w:rPr>
+          <w:rFonts w:cs="Times New Roman"/>
+          <w:b w:val="0"/>
+        </w:rPr>
         <w:t xml:space="preserve"> 6 </w:t>
       </w:r>
       <w:r>
@@ -21312,7 +21435,7 @@
       <w:pPr>
         <w:pStyle w:val="Heading1"/>
       </w:pPr>
-      <w:bookmarkStart w:id="32" w:name="_Toc244023929"/>
+      <w:bookmarkStart w:id="32" w:name="_Toc244025438"/>
       <w:r>
         <w:rPr>
           <w:rFonts w:ascii="Times New Roman" w:eastAsia="黑体" w:hAnsi="Times New Roman" w:cs="Times New Roman"/>
@@ -22224,7 +22347,7 @@
       <w:pPr>
         <w:pStyle w:val="Heading1"/>
       </w:pPr>
-      <w:bookmarkStart w:id="33" w:name="_Toc244023930"/>
+      <w:bookmarkStart w:id="33" w:name="_Toc244025439"/>
       <w:r>
         <w:rPr>
           <w:rFonts w:ascii="Times New Roman" w:eastAsia="黑体" w:hAnsi="Times New Roman" w:cs="Times New Roman"/>
@@ -22243,7 +22366,7 @@
       <w:pPr>
         <w:pStyle w:val="Heading2"/>
       </w:pPr>
-      <w:bookmarkStart w:id="34" w:name="_Toc244023931"/>
+      <w:bookmarkStart w:id="34" w:name="_Toc244025440"/>
       <w:r>
         <w:rPr>
           <w:rFonts w:ascii="Times New Roman" w:eastAsia="黑体" w:hAnsi="Times New Roman" w:cs="Times New Roman"/>
@@ -22295,6 +22418,13 @@
           <w:sz w:val="17"/>
         </w:rPr>
         <w:br/>
+      </w:r>
+      <w:r>
+        <w:rPr>
+          <w:rFonts w:ascii="Courier New" w:hAnsi="Courier New" w:cs="Courier New"/>
+          <w:color w:val="1F1F1F"/>
+          <w:sz w:val="17"/>
+        </w:rPr>
         <w:t>python scripts/verify_mongoose.js      →  Mongoose schema checks passed</w:t>
       </w:r>
       <w:r>
@@ -22488,7 +22618,7 @@
       <w:pPr>
         <w:pStyle w:val="Heading2"/>
       </w:pPr>
-      <w:bookmarkStart w:id="35" w:name="_Toc244023932"/>
+      <w:bookmarkStart w:id="35" w:name="_Toc244025441"/>
       <w:r>
         <w:rPr>
           <w:rFonts w:ascii="Times New Roman" w:eastAsia="黑体" w:hAnsi="Times New Roman" w:cs="Times New Roman"/>
@@ -24531,7 +24661,7 @@
       <w:pPr>
         <w:pStyle w:val="Heading2"/>
       </w:pPr>
-      <w:bookmarkStart w:id="36" w:name="_Toc244023933"/>
+      <w:bookmarkStart w:id="36" w:name="_Toc244025442"/>
       <w:r>
         <w:rPr>
           <w:rFonts w:ascii="Times New Roman" w:eastAsia="黑体" w:hAnsi="Times New Roman" w:cs="Times New Roman"/>
@@ -24694,9 +24824,153 @@
     </w:p>
     <w:p>
       <w:pPr>
+        <w:spacing w:after="80"/>
+        <w:jc w:val="both"/>
+      </w:pPr>
+      <w:r>
+        <w:rPr>
+          <w:rFonts w:cs="Times New Roman"/>
+        </w:rPr>
+        <w:t>课程要求的六类必测场景均有执行记录：创建问卷（</w:t>
+      </w:r>
+      <w:r>
+        <w:rPr>
+          <w:rFonts w:cs="Times New Roman"/>
+        </w:rPr>
+        <w:t>TC-SUR-001</w:t>
+      </w:r>
+      <w:r>
+        <w:rPr>
+          <w:rFonts w:cs="Times New Roman"/>
+        </w:rPr>
+        <w:t>）、添加题目（</w:t>
+      </w:r>
+      <w:r>
+        <w:rPr>
+          <w:rFonts w:cs="Times New Roman"/>
+        </w:rPr>
+        <w:t xml:space="preserve">TC-QUE-001 </w:t>
+      </w:r>
+      <w:r>
+        <w:rPr>
+          <w:rFonts w:cs="Times New Roman"/>
+        </w:rPr>
+        <w:t>至</w:t>
+      </w:r>
+      <w:r>
+        <w:rPr>
+          <w:rFonts w:cs="Times New Roman"/>
+        </w:rPr>
+        <w:t xml:space="preserve"> TC-QUE-006</w:t>
+      </w:r>
+      <w:r>
+        <w:rPr>
+          <w:rFonts w:cs="Times New Roman"/>
+        </w:rPr>
+        <w:t>）、跳转逻辑（</w:t>
+      </w:r>
+      <w:r>
+        <w:rPr>
+          <w:rFonts w:cs="Times New Roman"/>
+        </w:rPr>
+        <w:t>TC-JMP-001</w:t>
+      </w:r>
+      <w:r>
+        <w:rPr>
+          <w:rFonts w:cs="Times New Roman"/>
+        </w:rPr>
+        <w:t>、</w:t>
+      </w:r>
+      <w:r>
+        <w:rPr>
+          <w:rFonts w:cs="Times New Roman"/>
+        </w:rPr>
+        <w:t>TC-JMP-002</w:t>
+      </w:r>
+      <w:r>
+        <w:rPr>
+          <w:rFonts w:cs="Times New Roman"/>
+        </w:rPr>
+        <w:t>）、校验（</w:t>
+      </w:r>
+      <w:r>
+        <w:rPr>
+          <w:rFonts w:cs="Times New Roman"/>
+        </w:rPr>
+        <w:t xml:space="preserve">TC-VAL-001 </w:t>
+      </w:r>
+      <w:r>
+        <w:rPr>
+          <w:rFonts w:cs="Times New Roman"/>
+        </w:rPr>
+        <w:t>至</w:t>
+      </w:r>
+      <w:r>
+        <w:rPr>
+          <w:rFonts w:cs="Times New Roman"/>
+        </w:rPr>
+        <w:t xml:space="preserve"> TC-VAL-004</w:t>
+      </w:r>
+      <w:r>
+        <w:rPr>
+          <w:rFonts w:cs="Times New Roman"/>
+        </w:rPr>
+        <w:t>）、提交问卷（</w:t>
+      </w:r>
+      <w:r>
+        <w:rPr>
+          <w:rFonts w:cs="Times New Roman"/>
+        </w:rPr>
+        <w:t>TC-SUB-001</w:t>
+      </w:r>
+      <w:r>
+        <w:rPr>
+          <w:rFonts w:cs="Times New Roman"/>
+        </w:rPr>
+        <w:t>、</w:t>
+      </w:r>
+      <w:r>
+        <w:rPr>
+          <w:rFonts w:cs="Times New Roman"/>
+        </w:rPr>
+        <w:t>TC-SUB-002</w:t>
+      </w:r>
+      <w:r>
+        <w:rPr>
+          <w:rFonts w:cs="Times New Roman"/>
+        </w:rPr>
+        <w:t>）和统计（</w:t>
+      </w:r>
+      <w:r>
+        <w:rPr>
+          <w:rFonts w:cs="Times New Roman"/>
+        </w:rPr>
+        <w:t xml:space="preserve">TC-STA-001 </w:t>
+      </w:r>
+      <w:r>
+        <w:rPr>
+          <w:rFonts w:cs="Times New Roman"/>
+        </w:rPr>
+        <w:t>至</w:t>
+      </w:r>
+      <w:r>
+        <w:rPr>
+          <w:rFonts w:cs="Times New Roman"/>
+        </w:rPr>
+        <w:t xml:space="preserve"> TC-STA-003</w:t>
+      </w:r>
+      <w:r>
+        <w:rPr>
+          <w:rFonts w:cs="Times New Roman"/>
+        </w:rPr>
+        <w:t>），实际结果全部通过。</w:t>
+      </w:r>
+    </w:p>
+    <w:p>
+      <w:pPr>
         <w:pStyle w:val="Heading2"/>
       </w:pPr>
-      <w:bookmarkStart w:id="37" w:name="_Toc244023934"/>
+      <w:bookmarkStart w:id="37" w:name="_Toc244025443"/>
       <w:r>
         <w:rPr>
           <w:rFonts w:ascii="Times New Roman" w:eastAsia="黑体" w:hAnsi="Times New Roman" w:cs="Times New Roman"/>
@@ -25366,7 +25640,7 @@
       <w:pPr>
         <w:pStyle w:val="Heading1"/>
       </w:pPr>
-      <w:bookmarkStart w:id="38" w:name="_Toc244023935"/>
+      <w:bookmarkStart w:id="38" w:name="_Toc244025444"/>
       <w:r>
         <w:rPr>
           <w:rFonts w:ascii="Times New Roman" w:eastAsia="黑体" w:hAnsi="Times New Roman" w:cs="Times New Roman"/>
@@ -26407,7 +26681,7 @@
       <w:pPr>
         <w:pStyle w:val="Heading1"/>
       </w:pPr>
-      <w:bookmarkStart w:id="39" w:name="_Toc244023936"/>
+      <w:bookmarkStart w:id="39" w:name="_Toc244025445"/>
       <w:r>
         <w:rPr>
           <w:rFonts w:ascii="Times New Roman" w:eastAsia="黑体" w:hAnsi="Times New Roman" w:cs="Times New Roman"/>
@@ -26699,7 +26973,7 @@
       <w:pPr>
         <w:pStyle w:val="Heading1"/>
       </w:pPr>
-      <w:bookmarkStart w:id="40" w:name="_Toc244023937"/>
+      <w:bookmarkStart w:id="40" w:name="_Toc244025446"/>
       <w:r>
         <w:rPr>
           <w:rFonts w:ascii="Times New Roman" w:eastAsia="黑体" w:hAnsi="Times New Roman" w:cs="Times New Roman"/>
@@ -26718,7 +26992,7 @@
       <w:pPr>
         <w:pStyle w:val="Heading2"/>
       </w:pPr>
-      <w:bookmarkStart w:id="41" w:name="_Toc244023938"/>
+      <w:bookmarkStart w:id="41" w:name="_Toc244025447"/>
       <w:r>
         <w:rPr>
           <w:rFonts w:ascii="Times New Roman" w:eastAsia="黑体" w:hAnsi="Times New Roman" w:cs="Times New Roman"/>
@@ -26935,7 +27209,7 @@
       <w:pPr>
         <w:pStyle w:val="Heading2"/>
       </w:pPr>
-      <w:bookmarkStart w:id="42" w:name="_Toc244023939"/>
+      <w:bookmarkStart w:id="42" w:name="_Toc244025448"/>
       <w:r>
         <w:rPr>
           <w:rFonts w:ascii="Times New Roman" w:eastAsia="黑体" w:hAnsi="Times New Roman" w:cs="Times New Roman"/>
@@ -27825,7 +28099,7 @@
       <w:pPr>
         <w:pStyle w:val="Heading2"/>
       </w:pPr>
-      <w:bookmarkStart w:id="43" w:name="_Toc244023940"/>
+      <w:bookmarkStart w:id="43" w:name="_Toc244025449"/>
       <w:r>
         <w:rPr>
           <w:rFonts w:ascii="Times New Roman" w:eastAsia="黑体" w:hAnsi="Times New Roman" w:cs="Times New Roman"/>
@@ -27932,7 +28206,7 @@
         <w:pStyle w:val="Heading1"/>
         <w:pageBreakBefore/>
       </w:pPr>
-      <w:bookmarkStart w:id="44" w:name="_Toc244023941"/>
+      <w:bookmarkStart w:id="44" w:name="_Toc244025450"/>
       <w:r>
         <w:rPr>
           <w:rFonts w:ascii="Times New Roman" w:eastAsia="黑体" w:hAnsi="Times New Roman" w:cs="Times New Roman"/>
@@ -29188,8 +29462,8 @@
       </w:r>
     </w:p>
     <w:sectPr>
-      <w:headerReference w:type="default" r:id="rId16"/>
-      <w:footerReference w:type="default" r:id="rId17"/>
+      <w:headerReference w:type="default" r:id="rId17"/>
+      <w:footerReference w:type="default" r:id="rId18"/>
       <w:pgSz w:w="11906" w:h="16838"/>
       <w:pgMar w:top="1440" w:right="1417" w:bottom="1440" w:left="1701" w:header="737" w:footer="794" w:gutter="0"/>
       <w:pgNumType w:start="1"/>
@@ -29619,31 +29893,31 @@
       </w:rPr>
     </w:lvl>
   </w:abstractNum>
-  <w:num w:numId="1" w16cid:durableId="1355153755">
+  <w:num w:numId="1" w16cid:durableId="2077244744">
     <w:abstractNumId w:val="8"/>
   </w:num>
-  <w:num w:numId="2" w16cid:durableId="521552640">
+  <w:num w:numId="2" w16cid:durableId="1814983383">
     <w:abstractNumId w:val="6"/>
   </w:num>
-  <w:num w:numId="3" w16cid:durableId="1067343145">
+  <w:num w:numId="3" w16cid:durableId="747919646">
     <w:abstractNumId w:val="5"/>
   </w:num>
-  <w:num w:numId="4" w16cid:durableId="653682286">
+  <w:num w:numId="4" w16cid:durableId="1048843181">
     <w:abstractNumId w:val="4"/>
   </w:num>
-  <w:num w:numId="5" w16cid:durableId="1839227730">
+  <w:num w:numId="5" w16cid:durableId="1512448260">
     <w:abstractNumId w:val="7"/>
   </w:num>
-  <w:num w:numId="6" w16cid:durableId="1530533980">
+  <w:num w:numId="6" w16cid:durableId="80488917">
     <w:abstractNumId w:val="3"/>
   </w:num>
-  <w:num w:numId="7" w16cid:durableId="1926306554">
+  <w:num w:numId="7" w16cid:durableId="1833566280">
     <w:abstractNumId w:val="2"/>
   </w:num>
-  <w:num w:numId="8" w16cid:durableId="508252587">
+  <w:num w:numId="8" w16cid:durableId="201983658">
     <w:abstractNumId w:val="1"/>
   </w:num>
-  <w:num w:numId="9" w16cid:durableId="1669748121">
+  <w:num w:numId="9" w16cid:durableId="1968312631">
     <w:abstractNumId w:val="0"/>
   </w:num>
 </w:numbering>
@@ -41051,7 +41325,7 @@
     <w:autoRedefine/>
     <w:uiPriority w:val="39"/>
     <w:unhideWhenUsed/>
-    <w:rsid w:val="007F2266"/>
+    <w:rsid w:val="00694594"/>
   </w:style>
   <w:style w:type="paragraph" w:styleId="TOC2">
     <w:name w:val="toc 2"/>
@@ -41060,7 +41334,7 @@
     <w:autoRedefine/>
     <w:uiPriority w:val="39"/>
     <w:unhideWhenUsed/>
-    <w:rsid w:val="007F2266"/>
+    <w:rsid w:val="00694594"/>
     <w:pPr>
       <w:ind w:leftChars="200" w:left="420"/>
     </w:pPr>
@@ -41070,7 +41344,7 @@
     <w:basedOn w:val="a2"/>
     <w:uiPriority w:val="99"/>
     <w:unhideWhenUsed/>
-    <w:rsid w:val="007F2266"/>
+    <w:rsid w:val="00694594"/>
     <w:rPr>
       <w:color w:val="0000FF" w:themeColor="hyperlink"/>
       <w:u w:val="single"/>

</xml_diff>